<commit_message>
Formulaire de saisine : assouplir le format d'envoi et retirer la mention des modèles
Le dossier n'a plus à être envoyé en un seul PDF, et la phrase renvoyant
aux modèles disponibles sur le site est retirée (modèles non publiés).

Co-Authored-By: Claude Fable 5.1 <noreply@anthropic.com>
</commit_message>
<xml_diff>
--- a/documents/SubmissionForm_IRB_Assas.docx
+++ b/documents/SubmissionForm_IRB_Assas.docx
@@ -16,18 +16,8 @@
           <w:color w:val="A20000"/>
           <w:sz w:val="22"/>
         </w:rPr>
-        <w:t>Université Paris Panthéon-</w:t>
-      </w:r>
-      <w:proofErr w:type="spellStart"/>
-      <w:r>
-        <w:rPr>
-          <w:b/>
-          <w:color w:val="A20000"/>
-          <w:sz w:val="22"/>
-        </w:rPr>
-        <w:t>Assas</w:t>
-      </w:r>
-      <w:proofErr w:type="spellEnd"/>
+        <w:t>Université Paris Panthéon-Assas</w:t>
+      </w:r>
     </w:p>
     <w:p>
       <w:pPr>
@@ -128,7 +118,7 @@
             <w:hyperlink r:id="rId8" w:history="1">
               <w:r>
                 <w:rPr>
-                  <w:rStyle w:val="Hyperlink"/>
+                  <w:rStyle w:val="Lienhypertexte"/>
                 </w:rPr>
                 <w:t>https://irb-assas-schoolofeconomics.github.io/</w:t>
               </w:r>
@@ -148,15 +138,12 @@
               <w:t>9</w:t>
             </w:r>
             <w:r>
-              <w:t>, must be submitted as</w:t>
-            </w:r>
-            <w:r>
-              <w:t xml:space="preserve"> a single PDF file to: </w:t>
+              <w:t xml:space="preserve">, must be submitted to: </w:t>
             </w:r>
             <w:hyperlink r:id="rId9" w:history="1">
               <w:r>
                 <w:rPr>
-                  <w:rStyle w:val="Hyperlink"/>
+                  <w:rStyle w:val="Lienhypertexte"/>
                 </w:rPr>
                 <w:t>irbassasecon@outlook.com</w:t>
               </w:r>
@@ -428,7 +415,7 @@
           <w:color w:val="A20000"/>
           <w:sz w:val="26"/>
         </w:rPr>
-        <w:t>1. Type o</w:t>
+        <w:t xml:space="preserve">1. Type of </w:t>
       </w:r>
       <w:r>
         <w:rPr>
@@ -436,7 +423,7 @@
           <w:color w:val="A20000"/>
           <w:sz w:val="26"/>
         </w:rPr>
-        <w:t xml:space="preserve">f </w:t>
+        <w:t>s</w:t>
       </w:r>
       <w:r>
         <w:rPr>
@@ -444,14 +431,6 @@
           <w:color w:val="A20000"/>
           <w:sz w:val="26"/>
         </w:rPr>
-        <w:t>s</w:t>
-      </w:r>
-      <w:r>
-        <w:rPr>
-          <w:b/>
-          <w:color w:val="A20000"/>
-          <w:sz w:val="26"/>
-        </w:rPr>
         <w:t>ubmission</w:t>
       </w:r>
     </w:p>
@@ -471,13 +450,7 @@
         <w:rPr>
           <w:rFonts w:ascii="Segoe UI Symbol" w:hAnsi="Segoe UI Symbol"/>
         </w:rPr>
-        <w:t>☐</w:t>
-      </w:r>
-      <w:r>
-        <w:rPr>
-          <w:rFonts w:ascii="Segoe UI Symbol" w:hAnsi="Segoe UI Symbol"/>
-        </w:rPr>
-        <w:t xml:space="preserve"> Initial submission</w:t>
+        <w:t>☐ Initial submission</w:t>
       </w:r>
     </w:p>
     <w:p>
@@ -489,13 +462,7 @@
         <w:rPr>
           <w:rFonts w:ascii="Segoe UI Symbol" w:hAnsi="Segoe UI Symbol"/>
         </w:rPr>
-        <w:t>☐</w:t>
-      </w:r>
-      <w:r>
-        <w:rPr>
-          <w:rFonts w:ascii="Segoe UI Symbol" w:hAnsi="Segoe UI Symbol"/>
-        </w:rPr>
-        <w:t xml:space="preserve"> Resubmission of a project that received an </w:t>
+        <w:t xml:space="preserve">☐ Resubmission of a project that received an </w:t>
       </w:r>
       <w:r>
         <w:rPr>
@@ -535,17 +502,7 @@
           <w:sz w:val="18"/>
           <w:szCs w:val="18"/>
         </w:rPr>
-        <w:t>Initial file no.: IRBASSAS-...........</w:t>
-      </w:r>
-      <w:r>
-        <w:rPr>
-          <w:i/>
-          <w:iCs/>
-          <w:color w:val="555B66"/>
-          <w:sz w:val="18"/>
-          <w:szCs w:val="18"/>
-        </w:rPr>
-        <w:t>.-..........    Attach a response letter addressing the IRB's comments. The same project may not be submitted more than three times (art. 17).</w:t>
+        <w:t>Initial file no.: IRBASSAS-............-..........    Attach a response letter addressing the IRB's comments. The same project may not be submitted more than three times (art. 17).</w:t>
       </w:r>
     </w:p>
     <w:p>
@@ -557,13 +514,7 @@
         <w:rPr>
           <w:rFonts w:ascii="Segoe UI Symbol" w:hAnsi="Segoe UI Symbol"/>
         </w:rPr>
-        <w:t>☐</w:t>
-      </w:r>
-      <w:r>
-        <w:rPr>
-          <w:rFonts w:ascii="Segoe UI Symbol" w:hAnsi="Segoe UI Symbol"/>
-        </w:rPr>
-        <w:t xml:space="preserve"> Amendment to a project that has received a favorable opinion (art. 18): simplified review procedure.</w:t>
+        <w:t>☐ Amendment to a project that has received a favorable opinion (art. 18): simplified review procedure.</w:t>
       </w:r>
     </w:p>
     <w:p>
@@ -577,15 +528,7 @@
           <w:color w:val="555B66"/>
           <w:sz w:val="18"/>
         </w:rPr>
-        <w:t>Initial fi</w:t>
-      </w:r>
-      <w:r>
-        <w:rPr>
-          <w:i/>
-          <w:color w:val="555B66"/>
-          <w:sz w:val="18"/>
-        </w:rPr>
-        <w:t>le no.: IRBASSAS-............-..........</w:t>
+        <w:t>Initial file no.: IRBASSAS-............-..........</w:t>
       </w:r>
     </w:p>
     <w:p>
@@ -675,6 +618,7 @@
           <w:color w:val="A20000"/>
           <w:sz w:val="26"/>
         </w:rPr>
+        <w:lastRenderedPageBreak/>
         <w:t>2. Principal investigator and research team</w:t>
       </w:r>
     </w:p>
@@ -1502,13 +1446,7 @@
               <w:rPr>
                 <w:b/>
               </w:rPr>
-              <w:t>Keywords (3 to 5</w:t>
-            </w:r>
-            <w:r>
-              <w:rPr>
-                <w:b/>
-              </w:rPr>
-              <w:t>)</w:t>
+              <w:t>Keywords (3 to 5)</w:t>
             </w:r>
           </w:p>
         </w:tc>
@@ -1570,6 +1508,7 @@
               <w:rPr>
                 <w:b/>
               </w:rPr>
+              <w:lastRenderedPageBreak/>
               <w:t>Planned data collection schedule (start – end)</w:t>
             </w:r>
           </w:p>
@@ -1652,13 +1591,7 @@
         <w:rPr>
           <w:rFonts w:ascii="Segoe UI Symbol" w:hAnsi="Segoe UI Symbol"/>
         </w:rPr>
-        <w:t>☐</w:t>
-      </w:r>
-      <w:r>
-        <w:rPr>
-          <w:rFonts w:ascii="Segoe UI Symbol" w:hAnsi="Segoe UI Symbol"/>
-        </w:rPr>
-        <w:t xml:space="preserve"> Laboratory experiment</w:t>
+        <w:t>☐ Laboratory experiment</w:t>
       </w:r>
     </w:p>
     <w:p>
@@ -1670,13 +1603,7 @@
         <w:rPr>
           <w:rFonts w:ascii="Segoe UI Symbol" w:hAnsi="Segoe UI Symbol"/>
         </w:rPr>
-        <w:t>☐</w:t>
-      </w:r>
-      <w:r>
-        <w:rPr>
-          <w:rFonts w:ascii="Segoe UI Symbol" w:hAnsi="Segoe UI Symbol"/>
-        </w:rPr>
-        <w:t xml:space="preserve"> Field experiment (including </w:t>
+        <w:t xml:space="preserve">☐ Field experiment (including </w:t>
       </w:r>
       <w:r>
         <w:rPr>
@@ -1700,13 +1627,7 @@
         <w:rPr>
           <w:rFonts w:ascii="Segoe UI Symbol" w:hAnsi="Segoe UI Symbol"/>
         </w:rPr>
-        <w:t>☐</w:t>
-      </w:r>
-      <w:r>
-        <w:rPr>
-          <w:rFonts w:ascii="Segoe UI Symbol" w:hAnsi="Segoe UI Symbol"/>
-        </w:rPr>
-        <w:t xml:space="preserve"> Online experiment or survey</w:t>
+        <w:t>☐ Online experiment or survey</w:t>
       </w:r>
     </w:p>
     <w:p>
@@ -1718,13 +1639,7 @@
         <w:rPr>
           <w:rFonts w:ascii="Segoe UI Symbol" w:hAnsi="Segoe UI Symbol"/>
         </w:rPr>
-        <w:t>☐</w:t>
-      </w:r>
-      <w:r>
-        <w:rPr>
-          <w:rFonts w:ascii="Segoe UI Symbol" w:hAnsi="Segoe UI Symbol"/>
-        </w:rPr>
-        <w:t xml:space="preserve"> Questionnaire survey</w:t>
+        <w:t>☐ Questionnaire survey</w:t>
       </w:r>
     </w:p>
     <w:p>
@@ -1736,13 +1651,7 @@
         <w:rPr>
           <w:rFonts w:ascii="Segoe UI Symbol" w:hAnsi="Segoe UI Symbol"/>
         </w:rPr>
-        <w:t>☐</w:t>
-      </w:r>
-      <w:r>
-        <w:rPr>
-          <w:rFonts w:ascii="Segoe UI Symbol" w:hAnsi="Segoe UI Symbol"/>
-        </w:rPr>
-        <w:t xml:space="preserve"> Interviews / qualitative methods</w:t>
+        <w:t>☐ Interviews / qualitative methods</w:t>
       </w:r>
     </w:p>
     <w:p>
@@ -1754,13 +1663,7 @@
         <w:rPr>
           <w:rFonts w:ascii="Segoe UI Symbol" w:hAnsi="Segoe UI Symbol"/>
         </w:rPr>
-        <w:t>☐</w:t>
-      </w:r>
-      <w:r>
-        <w:rPr>
-          <w:rFonts w:ascii="Segoe UI Symbol" w:hAnsi="Segoe UI Symbol"/>
-        </w:rPr>
-        <w:t xml:space="preserve"> Analysis of existing </w:t>
+        <w:t xml:space="preserve">☐ Analysis of existing </w:t>
       </w:r>
       <w:r>
         <w:rPr>
@@ -1784,13 +1687,7 @@
         <w:rPr>
           <w:rFonts w:ascii="Segoe UI Symbol" w:hAnsi="Segoe UI Symbol"/>
         </w:rPr>
-        <w:t>☐</w:t>
-      </w:r>
-      <w:r>
-        <w:rPr>
-          <w:rFonts w:ascii="Segoe UI Symbol" w:hAnsi="Segoe UI Symbol"/>
-        </w:rPr>
-        <w:t xml:space="preserve"> Other (specify): ............................................................</w:t>
+        <w:t>☐ Other (specify): ............................................................</w:t>
       </w:r>
     </w:p>
     <w:p>
@@ -1814,13 +1711,7 @@
         <w:rPr>
           <w:rFonts w:ascii="Segoe UI Symbol" w:hAnsi="Segoe UI Symbol"/>
         </w:rPr>
-        <w:t>☐</w:t>
-      </w:r>
-      <w:r>
-        <w:rPr>
-          <w:rFonts w:ascii="Segoe UI Symbol" w:hAnsi="Segoe UI Symbol"/>
-        </w:rPr>
-        <w:t xml:space="preserve"> Yes        ☐ No</w:t>
+        <w:t>☐ Yes        ☐ No</w:t>
       </w:r>
     </w:p>
     <w:p>
@@ -1849,15 +1740,7 @@
           <w:color w:val="A20000"/>
           <w:sz w:val="26"/>
         </w:rPr>
-        <w:t xml:space="preserve">4. </w:t>
-      </w:r>
-      <w:r>
-        <w:rPr>
-          <w:b/>
-          <w:color w:val="A20000"/>
-          <w:sz w:val="26"/>
-        </w:rPr>
-        <w:t>Project description</w:t>
+        <w:t>4. Project description</w:t>
       </w:r>
     </w:p>
     <w:p>
@@ -2108,15 +1991,7 @@
                 <w:color w:val="555B66"/>
                 <w:sz w:val="18"/>
               </w:rPr>
-              <w:t xml:space="preserve">Successive stages, duration of </w:t>
-            </w:r>
-            <w:r>
-              <w:rPr>
-                <w:i/>
-                <w:color w:val="555B66"/>
-                <w:sz w:val="18"/>
-              </w:rPr>
-              <w:t>each stage and total duration of participation; number of sessions where applicable. For a study using existing data, describe the data processing steps rather than participant involvement.</w:t>
+              <w:t>Successive stages, duration of each stage and total duration of participation; number of sessions where applicable. For a study using existing data, describe the data processing steps rather than participant involvement.</w:t>
             </w:r>
           </w:p>
           <w:p>
@@ -2226,6 +2101,7 @@
           <w:color w:val="A20000"/>
           <w:sz w:val="26"/>
         </w:rPr>
+        <w:lastRenderedPageBreak/>
         <w:t>5. Participants</w:t>
       </w:r>
     </w:p>
@@ -2361,13 +2237,7 @@
         <w:rPr>
           <w:b/>
         </w:rPr>
-        <w:t>5.1. Justification of s</w:t>
-      </w:r>
-      <w:r>
-        <w:rPr>
-          <w:b/>
-        </w:rPr>
-        <w:t>ample size</w:t>
+        <w:t>5.1. Justification of sample size</w:t>
       </w:r>
     </w:p>
     <w:tbl>
@@ -2956,13 +2826,7 @@
         <w:rPr>
           <w:rFonts w:ascii="Segoe UI Symbol" w:hAnsi="Segoe UI Symbol"/>
         </w:rPr>
-        <w:t>☐</w:t>
-      </w:r>
-      <w:r>
-        <w:rPr>
-          <w:rFonts w:ascii="Segoe UI Symbol" w:hAnsi="Segoe UI Symbol"/>
-        </w:rPr>
-        <w:t xml:space="preserve"> No compensation</w:t>
+        <w:t>☐ No compensation</w:t>
       </w:r>
     </w:p>
     <w:p>
@@ -2974,13 +2838,7 @@
         <w:rPr>
           <w:rFonts w:ascii="Segoe UI Symbol" w:hAnsi="Segoe UI Symbol"/>
         </w:rPr>
-        <w:t>☐</w:t>
-      </w:r>
-      <w:r>
-        <w:rPr>
-          <w:rFonts w:ascii="Segoe UI Symbol" w:hAnsi="Segoe UI Symbol"/>
-        </w:rPr>
-        <w:t xml:space="preserve"> Fixed participation allowance</w:t>
+        <w:t>☐ Fixed participation allowance</w:t>
       </w:r>
     </w:p>
     <w:p>
@@ -2992,13 +2850,7 @@
         <w:rPr>
           <w:rFonts w:ascii="Segoe UI Symbol" w:hAnsi="Segoe UI Symbol"/>
         </w:rPr>
-        <w:t>☐</w:t>
-      </w:r>
-      <w:r>
-        <w:rPr>
-          <w:rFonts w:ascii="Segoe UI Symbol" w:hAnsi="Segoe UI Symbol"/>
-        </w:rPr>
-        <w:t xml:space="preserve"> Earnings contingent on decisions made during the study</w:t>
+        <w:t>☐ Earnings contingent on decisions made during the study</w:t>
       </w:r>
     </w:p>
     <w:p>
@@ -3010,13 +2862,7 @@
         <w:rPr>
           <w:rFonts w:ascii="Segoe UI Symbol" w:hAnsi="Segoe UI Symbol"/>
         </w:rPr>
-        <w:t>☐</w:t>
-      </w:r>
-      <w:r>
-        <w:rPr>
-          <w:rFonts w:ascii="Segoe UI Symbol" w:hAnsi="Segoe UI Symbol"/>
-        </w:rPr>
-        <w:t xml:space="preserve"> Lottery payment (payment of a subset of participants or periods)</w:t>
+        <w:t>☐ Lottery payment (payment of a subset of participants or periods)</w:t>
       </w:r>
     </w:p>
     <w:p>
@@ -3028,13 +2874,7 @@
         <w:rPr>
           <w:rFonts w:ascii="Segoe UI Symbol" w:hAnsi="Segoe UI Symbol"/>
         </w:rPr>
-        <w:t>☐</w:t>
-      </w:r>
-      <w:r>
-        <w:rPr>
-          <w:rFonts w:ascii="Segoe UI Symbol" w:hAnsi="Segoe UI Symbol"/>
-        </w:rPr>
-        <w:t xml:space="preserve"> Other (specify): .......................................................</w:t>
+        <w:t>☐ Other (specify): .......................................................</w:t>
       </w:r>
     </w:p>
     <w:p>
@@ -3066,13 +2906,7 @@
         <w:rPr>
           <w:rFonts w:ascii="Segoe UI Symbol" w:hAnsi="Segoe UI Symbol"/>
         </w:rPr>
-        <w:t>☐</w:t>
-      </w:r>
-      <w:r>
-        <w:rPr>
-          <w:rFonts w:ascii="Segoe UI Symbol" w:hAnsi="Segoe UI Symbol"/>
-        </w:rPr>
-        <w:t xml:space="preserve"> Yes        ☐ No</w:t>
+        <w:t>☐ Yes        ☐ No</w:t>
       </w:r>
     </w:p>
     <w:p>
@@ -3081,10 +2915,8 @@
         <w:ind w:left="227"/>
       </w:pPr>
       <w:r>
-        <w:t>If yes, justify: ......................................</w:t>
-      </w:r>
-      <w:r>
-        <w:t>.........................................................</w:t>
+        <w:lastRenderedPageBreak/>
+        <w:t>If yes, justify: ...............................................................................................</w:t>
       </w:r>
     </w:p>
     <w:p>
@@ -3145,13 +2977,7 @@
         <w:rPr>
           <w:rFonts w:ascii="Segoe UI Symbol" w:hAnsi="Segoe UI Symbol"/>
         </w:rPr>
-        <w:t>☐</w:t>
-      </w:r>
-      <w:r>
-        <w:rPr>
-          <w:rFonts w:ascii="Segoe UI Symbol" w:hAnsi="Segoe UI Symbol"/>
-        </w:rPr>
-        <w:t xml:space="preserve"> Yes        ☐ No</w:t>
+        <w:t>☐ Yes        ☐ No</w:t>
       </w:r>
     </w:p>
     <w:p>
@@ -3175,13 +3001,7 @@
         <w:rPr>
           <w:rFonts w:ascii="Segoe UI Symbol" w:hAnsi="Segoe UI Symbol"/>
         </w:rPr>
-        <w:t>☐</w:t>
-      </w:r>
-      <w:r>
-        <w:rPr>
-          <w:rFonts w:ascii="Segoe UI Symbol" w:hAnsi="Segoe UI Symbol"/>
-        </w:rPr>
-        <w:t xml:space="preserve"> Yes        ☐ No</w:t>
+        <w:t>☐ Yes        ☐ No</w:t>
       </w:r>
     </w:p>
     <w:p>
@@ -3271,13 +3091,7 @@
         <w:rPr>
           <w:rFonts w:ascii="Segoe UI Symbol" w:hAnsi="Segoe UI Symbol"/>
         </w:rPr>
-        <w:t>☐</w:t>
-      </w:r>
-      <w:r>
-        <w:rPr>
-          <w:rFonts w:ascii="Segoe UI Symbol" w:hAnsi="Segoe UI Symbol"/>
-        </w:rPr>
-        <w:t xml:space="preserve"> Written consent (paper or electronic)</w:t>
+        <w:t>☐ Written consent (paper or electronic)</w:t>
       </w:r>
     </w:p>
     <w:p>
@@ -3289,13 +3103,7 @@
         <w:rPr>
           <w:rFonts w:ascii="Segoe UI Symbol" w:hAnsi="Segoe UI Symbol"/>
         </w:rPr>
-        <w:t>☐</w:t>
-      </w:r>
-      <w:r>
-        <w:rPr>
-          <w:rFonts w:ascii="Segoe UI Symbol" w:hAnsi="Segoe UI Symbol"/>
-        </w:rPr>
-        <w:t xml:space="preserve"> Recorded oral consent</w:t>
+        <w:t>☐ Recorded oral consent</w:t>
       </w:r>
     </w:p>
     <w:p>
@@ -3307,13 +3115,7 @@
         <w:rPr>
           <w:rFonts w:ascii="Segoe UI Symbol" w:hAnsi="Segoe UI Symbol"/>
         </w:rPr>
-        <w:t>☐</w:t>
-      </w:r>
-      <w:r>
-        <w:rPr>
-          <w:rFonts w:ascii="Segoe UI Symbol" w:hAnsi="Segoe UI Symbol"/>
-        </w:rPr>
-        <w:t xml:space="preserve"> </w:t>
+        <w:t xml:space="preserve">☐ </w:t>
       </w:r>
       <w:r>
         <w:rPr>
@@ -3337,13 +3139,7 @@
         <w:rPr>
           <w:rFonts w:ascii="Segoe UI Symbol" w:hAnsi="Segoe UI Symbol"/>
         </w:rPr>
-        <w:t>☐</w:t>
-      </w:r>
-      <w:r>
-        <w:rPr>
-          <w:rFonts w:ascii="Segoe UI Symbol" w:hAnsi="Segoe UI Symbol"/>
-        </w:rPr>
-        <w:t xml:space="preserve"> No consent obtained</w:t>
+        <w:t>☐ No consent obtained</w:t>
       </w:r>
     </w:p>
     <w:p>
@@ -3416,13 +3212,7 @@
         <w:rPr>
           <w:b/>
         </w:rPr>
-        <w:t>6.4. For mi</w:t>
-      </w:r>
-      <w:r>
-        <w:rPr>
-          <w:b/>
-        </w:rPr>
-        <w:t>nors or protected persons: is the consent of holders of parental authority or legal representatives, as well as the assent of the person, planned?</w:t>
+        <w:t>6.4. For minors or protected persons: is the consent of holders of parental authority or legal representatives, as well as the assent of the person, planned?</w:t>
       </w:r>
     </w:p>
     <w:p>
@@ -3434,13 +3224,7 @@
         <w:rPr>
           <w:rFonts w:ascii="Segoe UI Symbol" w:hAnsi="Segoe UI Symbol"/>
         </w:rPr>
-        <w:t>☐</w:t>
-      </w:r>
-      <w:r>
-        <w:rPr>
-          <w:rFonts w:ascii="Segoe UI Symbol" w:hAnsi="Segoe UI Symbol"/>
-        </w:rPr>
-        <w:t xml:space="preserve"> Yes        ☐ No        ☐ Not applicable</w:t>
+        <w:t>☐ Yes        ☐ No        ☐ Not applicable</w:t>
       </w:r>
     </w:p>
     <w:p>
@@ -3460,10 +3244,7 @@
         <w:keepNext/>
       </w:pPr>
       <w:r>
-        <w:t xml:space="preserve">How is the right to withdraw from the study </w:t>
-      </w:r>
-      <w:r>
-        <w:t>at any time, without justification, guaranteed? What are the consequences, in particular regarding compensation?</w:t>
+        <w:t>How is the right to withdraw from the study at any time, without justification, guaranteed? What are the consequences, in particular regarding compensation?</w:t>
       </w:r>
     </w:p>
     <w:tbl>
@@ -3536,13 +3317,7 @@
         <w:rPr>
           <w:rFonts w:ascii="Segoe UI Symbol" w:hAnsi="Segoe UI Symbol"/>
         </w:rPr>
-        <w:t>☐</w:t>
-      </w:r>
-      <w:r>
-        <w:rPr>
-          <w:rFonts w:ascii="Segoe UI Symbol" w:hAnsi="Segoe UI Symbol"/>
-        </w:rPr>
-        <w:t xml:space="preserve"> Yes        ☐ No</w:t>
+        <w:t>☐ Yes        ☐ No</w:t>
       </w:r>
     </w:p>
     <w:p>
@@ -3598,17 +3373,7 @@
           <w:sz w:val="18"/>
           <w:szCs w:val="18"/>
         </w:rPr>
-        <w:t xml:space="preserve"> and use </w:t>
-      </w:r>
-      <w:r>
-        <w:rPr>
-          <w:i/>
-          <w:iCs/>
-          <w:color w:val="555B66"/>
-          <w:sz w:val="18"/>
-          <w:szCs w:val="18"/>
-        </w:rPr>
-        <w:t>of voice or image.</w:t>
+        <w:t xml:space="preserve"> and use of voice or image.</w:t>
       </w:r>
     </w:p>
     <w:p>
@@ -3703,6 +3468,7 @@
         <w:rPr>
           <w:b/>
         </w:rPr>
+        <w:lastRenderedPageBreak/>
         <w:t>7.2. Foreseeable risks, constraints, and inconveniences for participants, and preventive measures</w:t>
       </w:r>
     </w:p>
@@ -3789,13 +3555,7 @@
         <w:rPr>
           <w:rFonts w:ascii="Segoe UI Symbol" w:hAnsi="Segoe UI Symbol"/>
         </w:rPr>
-        <w:t>☐</w:t>
-      </w:r>
-      <w:r>
-        <w:rPr>
-          <w:rFonts w:ascii="Segoe UI Symbol" w:hAnsi="Segoe UI Symbol"/>
-        </w:rPr>
-        <w:t xml:space="preserve"> Yes        ☐ No</w:t>
+        <w:t>☐ Yes        ☐ No</w:t>
       </w:r>
     </w:p>
     <w:p>
@@ -3912,15 +3672,7 @@
                 <w:color w:val="555B66"/>
                 <w:sz w:val="18"/>
               </w:rPr>
-              <w:t xml:space="preserve">Criteria for discontinuing an individual's participation and criteria for stopping the study altogether. Indicate 'not </w:t>
-            </w:r>
-            <w:r>
-              <w:rPr>
-                <w:i/>
-                <w:color w:val="555B66"/>
-                <w:sz w:val="18"/>
-              </w:rPr>
-              <w:t>applicable' where relevant (e.g. study using existing data).</w:t>
+              <w:t>Criteria for discontinuing an individual's participation and criteria for stopping the study altogether. Indicate 'not applicable' where relevant (e.g. study using existing data).</w:t>
             </w:r>
           </w:p>
           <w:p>
@@ -3989,15 +3741,7 @@
                 <w:color w:val="555B66"/>
                 <w:sz w:val="18"/>
               </w:rPr>
-              <w:t>Information provided to participants at the end of the session or interview, and arrangements for accessing the overall study results. Indicate 'not applicable' wh</w:t>
-            </w:r>
-            <w:r>
-              <w:rPr>
-                <w:i/>
-                <w:color w:val="555B66"/>
-                <w:sz w:val="18"/>
-              </w:rPr>
-              <w:t>ere relevant (e.g. study using existing data).</w:t>
+              <w:t>Information provided to participants at the end of the session or interview, and arrangements for accessing the overall study results. Indicate 'not applicable' where relevant (e.g. study using existing data).</w:t>
             </w:r>
           </w:p>
           <w:p>
@@ -4034,7 +3778,7 @@
       </w:r>
       <w:r>
         <w:rPr>
-          <w:rStyle w:val="FootnoteReference"/>
+          <w:rStyle w:val="Appelnotedebasdep"/>
           <w:b/>
           <w:color w:val="A20000"/>
           <w:sz w:val="26"/>
@@ -4107,13 +3851,13 @@
       <w:hyperlink r:id="rId10" w:history="1">
         <w:r>
           <w:rPr>
-            <w:rStyle w:val="Hyperlink"/>
+            <w:rStyle w:val="Lienhypertexte"/>
           </w:rPr>
           <w:t>dpo</w:t>
         </w:r>
         <w:r>
           <w:rPr>
-            <w:rStyle w:val="Hyperlink"/>
+            <w:rStyle w:val="Lienhypertexte"/>
             <w:lang w:val="en-GB"/>
           </w:rPr>
           <w:t>@assas-universite.fr</w:t>
@@ -4165,19 +3909,7 @@
         <w:rPr>
           <w:rFonts w:ascii="Segoe UI Symbol" w:hAnsi="Segoe UI Symbol"/>
         </w:rPr>
-        <w:t>☐</w:t>
-      </w:r>
-      <w:r>
-        <w:rPr>
-          <w:rFonts w:ascii="Segoe UI Symbol" w:hAnsi="Segoe UI Symbol"/>
-        </w:rPr>
-        <w:t xml:space="preserve"> Decisions and behaviors observed </w:t>
-      </w:r>
-      <w:r>
-        <w:rPr>
-          <w:rFonts w:ascii="Segoe UI Symbol" w:hAnsi="Segoe UI Symbol"/>
-        </w:rPr>
-        <w:t>during the study</w:t>
+        <w:t>☐ Decisions and behaviors observed during the study</w:t>
       </w:r>
     </w:p>
     <w:p>
@@ -4189,13 +3921,7 @@
         <w:rPr>
           <w:rFonts w:ascii="Segoe UI Symbol" w:hAnsi="Segoe UI Symbol"/>
         </w:rPr>
-        <w:t>☐</w:t>
-      </w:r>
-      <w:r>
-        <w:rPr>
-          <w:rFonts w:ascii="Segoe UI Symbol" w:hAnsi="Segoe UI Symbol"/>
-        </w:rPr>
-        <w:t xml:space="preserve"> Responses to questionnaires</w:t>
+        <w:t>☐ Responses to questionnaires</w:t>
       </w:r>
     </w:p>
     <w:p>
@@ -4207,13 +3933,7 @@
         <w:rPr>
           <w:rFonts w:ascii="Segoe UI Symbol" w:hAnsi="Segoe UI Symbol"/>
         </w:rPr>
-        <w:t>☐</w:t>
-      </w:r>
-      <w:r>
-        <w:rPr>
-          <w:rFonts w:ascii="Segoe UI Symbol" w:hAnsi="Segoe UI Symbol"/>
-        </w:rPr>
-        <w:t xml:space="preserve"> Socio-demographic characteristics (age, gender, level of education…)</w:t>
+        <w:t>☐ Socio-demographic characteristics (age, gender, level of education…)</w:t>
       </w:r>
     </w:p>
     <w:p>
@@ -4225,13 +3945,7 @@
         <w:rPr>
           <w:rFonts w:ascii="Segoe UI Symbol" w:hAnsi="Segoe UI Symbol"/>
         </w:rPr>
-        <w:t>☐</w:t>
-      </w:r>
-      <w:r>
-        <w:rPr>
-          <w:rFonts w:ascii="Segoe UI Symbol" w:hAnsi="Segoe UI Symbol"/>
-        </w:rPr>
-        <w:t xml:space="preserve"> Physiological or biometric measurements</w:t>
+        <w:t>☐ Physiological or biometric measurements</w:t>
       </w:r>
     </w:p>
     <w:p>
@@ -4243,13 +3957,7 @@
         <w:rPr>
           <w:rFonts w:ascii="Segoe UI Symbol" w:hAnsi="Segoe UI Symbol"/>
         </w:rPr>
-        <w:t>☐</w:t>
-      </w:r>
-      <w:r>
-        <w:rPr>
-          <w:rFonts w:ascii="Segoe UI Symbol" w:hAnsi="Segoe UI Symbol"/>
-        </w:rPr>
-        <w:t xml:space="preserve"> Audio or video recordings</w:t>
+        <w:t>☐ Audio or video recordings</w:t>
       </w:r>
     </w:p>
     <w:p>
@@ -4261,13 +3969,7 @@
         <w:rPr>
           <w:rFonts w:ascii="Segoe UI Symbol" w:hAnsi="Segoe UI Symbol"/>
         </w:rPr>
-        <w:t>☐</w:t>
-      </w:r>
-      <w:r>
-        <w:rPr>
-          <w:rFonts w:ascii="Segoe UI Symbol" w:hAnsi="Segoe UI Symbol"/>
-        </w:rPr>
-        <w:t xml:space="preserve"> Digital traces (connection logs, IP address…)</w:t>
+        <w:t>☐ Digital traces (connection logs, IP address…)</w:t>
       </w:r>
     </w:p>
     <w:p>
@@ -4279,13 +3981,7 @@
         <w:rPr>
           <w:rFonts w:ascii="Segoe UI Symbol" w:hAnsi="Segoe UI Symbol"/>
         </w:rPr>
-        <w:t>☐</w:t>
-      </w:r>
-      <w:r>
-        <w:rPr>
-          <w:rFonts w:ascii="Segoe UI Symbol" w:hAnsi="Segoe UI Symbol"/>
-        </w:rPr>
-        <w:t xml:space="preserve"> Data from existing databases (administrative, private…)</w:t>
+        <w:t>☐ Data from existing databases (administrative, private…)</w:t>
       </w:r>
     </w:p>
     <w:p>
@@ -4297,13 +3993,7 @@
         <w:rPr>
           <w:rFonts w:ascii="Segoe UI Symbol" w:hAnsi="Segoe UI Symbol"/>
         </w:rPr>
-        <w:t>☐</w:t>
-      </w:r>
-      <w:r>
-        <w:rPr>
-          <w:rFonts w:ascii="Segoe UI Symbol" w:hAnsi="Segoe UI Symbol"/>
-        </w:rPr>
-        <w:t xml:space="preserve"> Other (specify): .......................................................</w:t>
+        <w:t>☐ Other (specify): .......................................................</w:t>
       </w:r>
     </w:p>
     <w:p>
@@ -4339,13 +4029,7 @@
         <w:rPr>
           <w:rFonts w:ascii="Segoe UI Symbol" w:hAnsi="Segoe UI Symbol"/>
         </w:rPr>
-        <w:t>☐</w:t>
-      </w:r>
-      <w:r>
-        <w:rPr>
-          <w:rFonts w:ascii="Segoe UI Symbol" w:hAnsi="Segoe UI Symbol"/>
-        </w:rPr>
-        <w:t xml:space="preserve"> Data anonymous from collection </w:t>
+        <w:t xml:space="preserve">☐ Data anonymous from collection </w:t>
       </w:r>
       <w:r>
         <w:rPr>
@@ -4363,13 +4047,7 @@
         <w:rPr>
           <w:rFonts w:ascii="Segoe UI Symbol" w:hAnsi="Segoe UI Symbol"/>
         </w:rPr>
-        <w:t>☐</w:t>
-      </w:r>
-      <w:r>
-        <w:rPr>
-          <w:rFonts w:ascii="Segoe UI Symbol" w:hAnsi="Segoe UI Symbol"/>
-        </w:rPr>
-        <w:t xml:space="preserve"> </w:t>
+        <w:t xml:space="preserve">☐ </w:t>
       </w:r>
       <w:r>
         <w:rPr>
@@ -4399,13 +4077,8 @@
         <w:rPr>
           <w:rFonts w:ascii="Segoe UI Symbol" w:hAnsi="Segoe UI Symbol"/>
         </w:rPr>
-        <w:t>☐</w:t>
-      </w:r>
-      <w:r>
-        <w:rPr>
-          <w:rFonts w:ascii="Segoe UI Symbol" w:hAnsi="Segoe UI Symbol"/>
-        </w:rPr>
-        <w:t xml:space="preserve"> Directly identifying data</w:t>
+        <w:lastRenderedPageBreak/>
+        <w:t>☐ Directly identifying data</w:t>
       </w:r>
       <w:r>
         <w:rPr>
@@ -4553,13 +4226,7 @@
         <w:rPr>
           <w:b/>
         </w:rPr>
-        <w:t>. Will sensitive data within the meaning of Article 9 of the GDPR be collected (racial</w:t>
-      </w:r>
-      <w:r>
-        <w:rPr>
-          <w:b/>
-        </w:rPr>
-        <w:t xml:space="preserve"> or ethnic origin, political opinions, religious or philosophical beliefs, trade union membership, health data, sex life or sexual orientation, genetic or biometric data)?</w:t>
+        <w:t>. Will sensitive data within the meaning of Article 9 of the GDPR be collected (racial or ethnic origin, political opinions, religious or philosophical beliefs, trade union membership, health data, sex life or sexual orientation, genetic or biometric data)?</w:t>
       </w:r>
     </w:p>
     <w:p>
@@ -4571,13 +4238,7 @@
         <w:rPr>
           <w:rFonts w:ascii="Segoe UI Symbol" w:hAnsi="Segoe UI Symbol"/>
         </w:rPr>
-        <w:t>☐</w:t>
-      </w:r>
-      <w:r>
-        <w:rPr>
-          <w:rFonts w:ascii="Segoe UI Symbol" w:hAnsi="Segoe UI Symbol"/>
-        </w:rPr>
-        <w:t xml:space="preserve"> Yes        ☐ No</w:t>
+        <w:t>☐ Yes        ☐ No</w:t>
       </w:r>
     </w:p>
     <w:p>
@@ -4668,13 +4329,7 @@
         <w:rPr>
           <w:b/>
         </w:rPr>
-        <w:t>. Access, storage, and retent</w:t>
-      </w:r>
-      <w:r>
-        <w:rPr>
-          <w:b/>
-        </w:rPr>
-        <w:t>ion</w:t>
+        <w:t>. Access, storage, and retention</w:t>
       </w:r>
     </w:p>
     <w:tbl>
@@ -4880,13 +4535,7 @@
         <w:rPr>
           <w:rFonts w:ascii="Segoe UI Symbol" w:hAnsi="Segoe UI Symbol"/>
         </w:rPr>
-        <w:t>☐</w:t>
-      </w:r>
-      <w:r>
-        <w:rPr>
-          <w:rFonts w:ascii="Segoe UI Symbol" w:hAnsi="Segoe UI Symbol"/>
-        </w:rPr>
-        <w:t xml:space="preserve"> Yes        ☐ No</w:t>
+        <w:t>☐ Yes        ☐ No</w:t>
       </w:r>
     </w:p>
     <w:p>
@@ -4909,10 +4558,7 @@
         <w:t xml:space="preserve">, </w:t>
       </w:r>
       <w:r>
-        <w:t>aggregated…): .........................................</w:t>
-      </w:r>
-      <w:r>
-        <w:t>......................</w:t>
+        <w:t>aggregated…): ...............................................................</w:t>
       </w:r>
     </w:p>
     <w:p>
@@ -4936,13 +4582,7 @@
         <w:rPr>
           <w:rFonts w:ascii="Segoe UI Symbol" w:hAnsi="Segoe UI Symbol"/>
         </w:rPr>
-        <w:t>☐</w:t>
-      </w:r>
-      <w:r>
-        <w:rPr>
-          <w:rFonts w:ascii="Segoe UI Symbol" w:hAnsi="Segoe UI Symbol"/>
-        </w:rPr>
-        <w:t xml:space="preserve"> Yes        ☐ No</w:t>
+        <w:t>☐ Yes        ☐ No</w:t>
       </w:r>
     </w:p>
     <w:p>
@@ -5020,13 +4660,7 @@
         <w:rPr>
           <w:rFonts w:ascii="Segoe UI Symbol" w:hAnsi="Segoe UI Symbol"/>
         </w:rPr>
-        <w:t>☐</w:t>
-      </w:r>
-      <w:r>
-        <w:rPr>
-          <w:rFonts w:ascii="Segoe UI Symbol" w:hAnsi="Segoe UI Symbol"/>
-        </w:rPr>
-        <w:t xml:space="preserve"> This completed and signed submission form</w:t>
+        <w:t>☐ This completed and signed submission form</w:t>
       </w:r>
     </w:p>
     <w:p>
@@ -5038,13 +4672,7 @@
         <w:rPr>
           <w:rFonts w:ascii="Segoe UI Symbol" w:hAnsi="Segoe UI Symbol"/>
         </w:rPr>
-        <w:t>☐</w:t>
-      </w:r>
-      <w:r>
-        <w:rPr>
-          <w:rFonts w:ascii="Segoe UI Symbol" w:hAnsi="Segoe UI Symbol"/>
-        </w:rPr>
-        <w:t xml:space="preserve"> The detailed research protocol (including, if possible, the instructions given to participants)</w:t>
+        <w:t>☐ The detailed research protocol (including, if possible, the instructions given to participants)</w:t>
       </w:r>
     </w:p>
     <w:p>
@@ -5056,13 +4684,7 @@
         <w:rPr>
           <w:rFonts w:ascii="Segoe UI Symbol" w:hAnsi="Segoe UI Symbol"/>
         </w:rPr>
-        <w:t>☐</w:t>
-      </w:r>
-      <w:r>
-        <w:rPr>
-          <w:rFonts w:ascii="Segoe UI Symbol" w:hAnsi="Segoe UI Symbol"/>
-        </w:rPr>
-        <w:t xml:space="preserve"> The participant information sheet</w:t>
+        <w:t>☐ The participant information sheet</w:t>
       </w:r>
     </w:p>
     <w:p>
@@ -5074,13 +4696,7 @@
         <w:rPr>
           <w:rFonts w:ascii="Segoe UI Symbol" w:hAnsi="Segoe UI Symbol"/>
         </w:rPr>
-        <w:t>☐</w:t>
-      </w:r>
-      <w:r>
-        <w:rPr>
-          <w:rFonts w:ascii="Segoe UI Symbol" w:hAnsi="Segoe UI Symbol"/>
-        </w:rPr>
-        <w:t xml:space="preserve"> The informed consent form</w:t>
+        <w:t>☐ The informed consent form</w:t>
       </w:r>
     </w:p>
     <w:p>
@@ -5092,19 +4708,7 @@
         <w:rPr>
           <w:rFonts w:ascii="Segoe UI Symbol" w:hAnsi="Segoe UI Symbol"/>
         </w:rPr>
-        <w:t>☐</w:t>
-      </w:r>
-      <w:r>
-        <w:rPr>
-          <w:rFonts w:ascii="Segoe UI Symbol" w:hAnsi="Segoe UI Symbol"/>
-        </w:rPr>
-        <w:t xml:space="preserve"> If applicable: the</w:t>
-      </w:r>
-      <w:r>
-        <w:rPr>
-          <w:rFonts w:ascii="Segoe UI Symbol" w:hAnsi="Segoe UI Symbol"/>
-        </w:rPr>
-        <w:t xml:space="preserve"> </w:t>
+        <w:t xml:space="preserve">☐ If applicable: the </w:t>
       </w:r>
       <w:r>
         <w:rPr>
@@ -5128,13 +4732,7 @@
         <w:rPr>
           <w:rFonts w:ascii="Segoe UI Symbol" w:hAnsi="Segoe UI Symbol"/>
         </w:rPr>
-        <w:t>☐</w:t>
-      </w:r>
-      <w:r>
-        <w:rPr>
-          <w:rFonts w:ascii="Segoe UI Symbol" w:hAnsi="Segoe UI Symbol"/>
-        </w:rPr>
-        <w:t xml:space="preserve"> If applicable: recruitment materials, questionnaires, and interview guides</w:t>
+        <w:t>☐ If applicable: recruitment materials, questionnaires, and interview guides</w:t>
       </w:r>
     </w:p>
     <w:p>
@@ -5146,13 +4744,7 @@
         <w:rPr>
           <w:rFonts w:ascii="Segoe UI Symbol" w:hAnsi="Segoe UI Symbol"/>
         </w:rPr>
-        <w:t>☐</w:t>
-      </w:r>
-      <w:r>
-        <w:rPr>
-          <w:rFonts w:ascii="Segoe UI Symbol" w:hAnsi="Segoe UI Symbol"/>
-        </w:rPr>
-        <w:t xml:space="preserve"> In the case of resubmission: the response letter addressing the IRB's comments</w:t>
+        <w:t>☐ In the case of resubmission: the response letter addressing the IRB's comments</w:t>
       </w:r>
     </w:p>
     <w:p>
@@ -5164,27 +4756,7 @@
         <w:rPr>
           <w:rFonts w:ascii="Segoe UI Symbol" w:hAnsi="Segoe UI Symbol"/>
         </w:rPr>
-        <w:t>☐</w:t>
-      </w:r>
-      <w:r>
-        <w:rPr>
-          <w:rFonts w:ascii="Segoe UI Symbol" w:hAnsi="Segoe UI Symbol"/>
-        </w:rPr>
-        <w:t xml:space="preserve"> Any other document deemed useful for the ethical review</w:t>
-      </w:r>
-    </w:p>
-    <w:p>
-      <w:pPr>
-        <w:keepNext/>
-        <w:jc w:val="both"/>
-      </w:pPr>
-      <w:r>
-        <w:rPr>
-          <w:i/>
-          <w:color w:val="555B66"/>
-          <w:sz w:val="18"/>
-        </w:rPr>
-        <w:t>Templates for the participant information sheet and the informed consent form are available on the IRB website (art. 22).</w:t>
+        <w:t>☐ Any other document deemed useful for the ethical review</w:t>
       </w:r>
     </w:p>
     <w:p>
@@ -5204,6 +4776,7 @@
           <w:color w:val="A20000"/>
           <w:sz w:val="26"/>
         </w:rPr>
+        <w:lastRenderedPageBreak/>
         <w:t>1</w:t>
       </w:r>
       <w:r>
@@ -5240,19 +4813,7 @@
         <w:rPr>
           <w:rFonts w:ascii="Segoe UI Symbol" w:hAnsi="Segoe UI Symbol"/>
         </w:rPr>
-        <w:t>☐</w:t>
-      </w:r>
-      <w:r>
-        <w:rPr>
-          <w:rFonts w:ascii="Segoe UI Symbol" w:hAnsi="Segoe UI Symbol"/>
-        </w:rPr>
-        <w:t xml:space="preserve"> certifies the accuracy of the information provided in </w:t>
-      </w:r>
-      <w:r>
-        <w:rPr>
-          <w:rFonts w:ascii="Segoe UI Symbol" w:hAnsi="Segoe UI Symbol"/>
-        </w:rPr>
-        <w:t>this form;</w:t>
+        <w:t>☐ certifies the accuracy of the information provided in this form;</w:t>
       </w:r>
     </w:p>
     <w:p>
@@ -5264,13 +4825,7 @@
         <w:rPr>
           <w:rFonts w:ascii="Segoe UI Symbol" w:hAnsi="Segoe UI Symbol"/>
         </w:rPr>
-        <w:t>☐</w:t>
-      </w:r>
-      <w:r>
-        <w:rPr>
-          <w:rFonts w:ascii="Segoe UI Symbol" w:hAnsi="Segoe UI Symbol"/>
-        </w:rPr>
-        <w:t xml:space="preserve"> certifies that the data collection covered by this submission has not yet begun, or, for a study based exclusively on already collected data, that their analysis has not yet begun;</w:t>
+        <w:t>☐ certifies that the data collection covered by this submission has not yet begun, or, for a study based exclusively on already collected data, that their analysis has not yet begun;</w:t>
       </w:r>
     </w:p>
     <w:p>
@@ -5282,13 +4837,7 @@
         <w:rPr>
           <w:rFonts w:ascii="Segoe UI Symbol" w:hAnsi="Segoe UI Symbol"/>
         </w:rPr>
-        <w:t>☐</w:t>
-      </w:r>
-      <w:r>
-        <w:rPr>
-          <w:rFonts w:ascii="Segoe UI Symbol" w:hAnsi="Segoe UI Symbol"/>
-        </w:rPr>
-        <w:t xml:space="preserve"> undertakes to conduct the research in accordance with the submitted application and to inform the IRB in writing of any modification to the protocol (art. 18);</w:t>
+        <w:t>☐ undertakes to conduct the research in accordance with the submitted application and to inform the IRB in writing of any modification to the protocol (art. 18);</w:t>
       </w:r>
     </w:p>
     <w:p>
@@ -5300,13 +4849,7 @@
         <w:rPr>
           <w:rFonts w:ascii="Segoe UI Symbol" w:hAnsi="Segoe UI Symbol"/>
         </w:rPr>
-        <w:t>☐</w:t>
-      </w:r>
-      <w:r>
-        <w:rPr>
-          <w:rFonts w:ascii="Segoe UI Symbol" w:hAnsi="Segoe UI Symbol"/>
-        </w:rPr>
-        <w:t xml:space="preserve"> undertakes to fulfil the legal formalities required before the relevant authorities, as the IRB opinion does not replace them (art. 1);</w:t>
+        <w:t>☐ undertakes to fulfil the legal formalities required before the relevant authorities, as the IRB opinion does not replace them (art. 1);</w:t>
       </w:r>
     </w:p>
     <w:p>
@@ -5318,19 +4861,7 @@
         <w:rPr>
           <w:rFonts w:ascii="Segoe UI Symbol" w:hAnsi="Segoe UI Symbol"/>
         </w:rPr>
-        <w:t>☐</w:t>
-      </w:r>
-      <w:r>
-        <w:rPr>
-          <w:rFonts w:ascii="Segoe UI Symbol" w:hAnsi="Segoe UI Symbol"/>
-        </w:rPr>
-        <w:t xml:space="preserve"> undertakes to up</w:t>
-      </w:r>
-      <w:r>
-        <w:rPr>
-          <w:rFonts w:ascii="Segoe UI Symbol" w:hAnsi="Segoe UI Symbol"/>
-        </w:rPr>
-        <w:t>hold the principles of scientific integrity and research ethics set out in the reference texts of the internal regulations (art. 21).</w:t>
+        <w:t>☐ undertakes to uphold the principles of scientific integrity and research ethics set out in the reference texts of the internal regulations (art. 21).</w:t>
       </w:r>
     </w:p>
     <w:p>
@@ -5470,7 +5001,7 @@
 <w:ftr xmlns:wpc="http://schemas.microsoft.com/office/word/2010/wordprocessingCanvas" xmlns:cx="http://schemas.microsoft.com/office/drawing/2014/chartex" xmlns:cx1="http://schemas.microsoft.com/office/drawing/2015/9/8/chartex" xmlns:cx2="http://schemas.microsoft.com/office/drawing/2015/10/21/chartex" xmlns:cx3="http://schemas.microsoft.com/office/drawing/2016/5/9/chartex" xmlns:cx4="http://schemas.microsoft.com/office/drawing/2016/5/10/chartex" xmlns:cx5="http://schemas.microsoft.com/office/drawing/2016/5/11/chartex" xmlns:cx6="http://schemas.microsoft.com/office/drawing/2016/5/12/chartex" xmlns:cx7="http://schemas.microsoft.com/office/drawing/2016/5/13/chartex" xmlns:cx8="http://schemas.microsoft.com/office/drawing/2016/5/14/chartex" xmlns:mc="http://schemas.openxmlformats.org/markup-compatibility/2006" xmlns:aink="http://schemas.microsoft.com/office/drawing/2016/ink" xmlns:am3d="http://schemas.microsoft.com/office/drawing/2017/model3d" xmlns:o="urn:schemas-microsoft-com:office:office" xmlns:oel="http://schemas.microsoft.com/office/2019/extlst" xmlns:r="http://schemas.openxmlformats.org/officeDocument/2006/relationships" xmlns:m="http://schemas.openxmlformats.org/officeDocument/2006/math" xmlns:v="urn:schemas-microsoft-com:vml" xmlns:wp14="http://schemas.microsoft.com/office/word/2010/wordprocessingDrawing" xmlns:wp="http://schemas.openxmlformats.org/drawingml/2006/wordprocessingDrawing" xmlns:w10="urn:schemas-microsoft-com:office:word" xmlns:w="http://schemas.openxmlformats.org/wordprocessingml/2006/main" xmlns:w14="http://schemas.microsoft.com/office/word/2010/wordml" xmlns:w15="http://schemas.microsoft.com/office/word/2012/wordml" xmlns:w16cex="http://schemas.microsoft.com/office/word/2018/wordml/cex" xmlns:w16cid="http://schemas.microsoft.com/office/word/2016/wordml/cid" xmlns:w16="http://schemas.microsoft.com/office/word/2018/wordml" xmlns:w16du="http://schemas.microsoft.com/office/word/2023/wordml/word16du" xmlns:w16sdtdh="http://schemas.microsoft.com/office/word/2020/wordml/sdtdatahash" xmlns:w16sdtfl="http://schemas.microsoft.com/office/word/2024/wordml/sdtformatlock" xmlns:w16se="http://schemas.microsoft.com/office/word/2015/wordml/symex" xmlns:wpg="http://schemas.microsoft.com/office/word/2010/wordprocessingGroup" xmlns:wpi="http://schemas.microsoft.com/office/word/2010/wordprocessingInk" xmlns:wne="http://schemas.microsoft.com/office/word/2006/wordml" xmlns:wps="http://schemas.microsoft.com/office/word/2010/wordprocessingShape" mc:Ignorable="w14 w15 w16se w16cid w16 w16cex w16sdtdh w16sdtfl w16du wp14">
   <w:p>
     <w:pPr>
-      <w:pStyle w:val="Footer"/>
+      <w:pStyle w:val="Pieddepage"/>
       <w:pBdr>
         <w:top w:val="single" w:sz="4" w:space="4" w:color="B8BFC9"/>
       </w:pBdr>
@@ -5481,59 +5012,13 @@
         <w:lang w:val="fr-FR"/>
       </w:rPr>
     </w:pPr>
-    <w:proofErr w:type="spellStart"/>
     <w:r>
       <w:rPr>
         <w:color w:val="555B66"/>
         <w:sz w:val="16"/>
         <w:lang w:val="fr-FR"/>
       </w:rPr>
-      <w:t>Submission</w:t>
-    </w:r>
-    <w:proofErr w:type="spellEnd"/>
-    <w:r>
-      <w:rPr>
-        <w:color w:val="555B66"/>
-        <w:sz w:val="16"/>
-        <w:lang w:val="fr-FR"/>
-      </w:rPr>
-      <w:t xml:space="preserve"> </w:t>
-    </w:r>
-    <w:proofErr w:type="spellStart"/>
-    <w:r>
-      <w:rPr>
-        <w:color w:val="555B66"/>
-        <w:sz w:val="16"/>
-        <w:lang w:val="fr-FR"/>
-      </w:rPr>
-      <w:t>form</w:t>
-    </w:r>
-    <w:proofErr w:type="spellEnd"/>
-    <w:r>
-      <w:rPr>
-        <w:color w:val="555B66"/>
-        <w:sz w:val="16"/>
-        <w:lang w:val="fr-FR"/>
-      </w:rPr>
-      <w:t xml:space="preserve"> -- IRB in </w:t>
-    </w:r>
-    <w:proofErr w:type="spellStart"/>
-    <w:r>
-      <w:rPr>
-        <w:color w:val="555B66"/>
-        <w:sz w:val="16"/>
-        <w:lang w:val="fr-FR"/>
-      </w:rPr>
-      <w:t>economics</w:t>
-    </w:r>
-    <w:proofErr w:type="spellEnd"/>
-    <w:r>
-      <w:rPr>
-        <w:color w:val="555B66"/>
-        <w:sz w:val="16"/>
-        <w:lang w:val="fr-FR"/>
-      </w:rPr>
-      <w:t xml:space="preserve"> – Université Paris Panthéon-Assas – (June 2026)</w:t>
+      <w:t>Submission form -- IRB in economics – Université Paris Panthéon-Assas – (June 2026)</w:t>
     </w:r>
     <w:r>
       <w:rPr>
@@ -5664,7 +5149,7 @@
       </w:pPr>
       <w:r>
         <w:rPr>
-          <w:rStyle w:val="FootnoteReference"/>
+          <w:rStyle w:val="Appelnotedebasdep"/>
         </w:rPr>
         <w:footnoteRef/>
       </w:r>
@@ -5743,7 +5228,7 @@
     <w:lvl w:ilvl="0">
       <w:start w:val="1"/>
       <w:numFmt w:val="decimal"/>
-      <w:pStyle w:val="ListNumber3"/>
+      <w:pStyle w:val="Listenumros3"/>
       <w:lvlText w:val="%1."/>
       <w:lvlJc w:val="left"/>
       <w:pPr>
@@ -5761,7 +5246,7 @@
     <w:lvl w:ilvl="0">
       <w:start w:val="1"/>
       <w:numFmt w:val="decimal"/>
-      <w:pStyle w:val="ListNumber2"/>
+      <w:pStyle w:val="Listenumros2"/>
       <w:lvlText w:val="%1."/>
       <w:lvlJc w:val="left"/>
       <w:pPr>
@@ -5799,7 +5284,7 @@
     <w:lvl w:ilvl="0">
       <w:start w:val="1"/>
       <w:numFmt w:val="bullet"/>
-      <w:pStyle w:val="ListBullet3"/>
+      <w:pStyle w:val="Listepuces3"/>
       <w:lvlText w:val=""/>
       <w:lvlJc w:val="left"/>
       <w:pPr>
@@ -5820,7 +5305,7 @@
     <w:lvl w:ilvl="0">
       <w:start w:val="1"/>
       <w:numFmt w:val="bullet"/>
-      <w:pStyle w:val="ListBullet2"/>
+      <w:pStyle w:val="Listepuces2"/>
       <w:lvlText w:val=""/>
       <w:lvlJc w:val="left"/>
       <w:pPr>
@@ -5841,7 +5326,7 @@
     <w:lvl w:ilvl="0">
       <w:start w:val="1"/>
       <w:numFmt w:val="decimal"/>
-      <w:pStyle w:val="ListNumber"/>
+      <w:pStyle w:val="Listenumros"/>
       <w:lvlText w:val="%1."/>
       <w:lvlJc w:val="left"/>
       <w:pPr>
@@ -5859,7 +5344,7 @@
     <w:lvl w:ilvl="0">
       <w:start w:val="1"/>
       <w:numFmt w:val="bullet"/>
-      <w:pStyle w:val="ListBullet"/>
+      <w:pStyle w:val="Listepuces"/>
       <w:lvlText w:val=""/>
       <w:lvlJc w:val="left"/>
       <w:pPr>
@@ -6301,11 +5786,11 @@
       <w:sz w:val="20"/>
     </w:rPr>
   </w:style>
-  <w:style w:type="paragraph" w:styleId="Heading1">
+  <w:style w:type="paragraph" w:styleId="Titre1">
     <w:name w:val="heading 1"/>
     <w:basedOn w:val="Normal"/>
     <w:next w:val="Normal"/>
-    <w:link w:val="Heading1Char"/>
+    <w:link w:val="Titre1Car"/>
     <w:uiPriority w:val="9"/>
     <w:qFormat/>
     <w:rsid w:val="00FC693F"/>
@@ -6324,11 +5809,11 @@
       <w:szCs w:val="28"/>
     </w:rPr>
   </w:style>
-  <w:style w:type="paragraph" w:styleId="Heading2">
+  <w:style w:type="paragraph" w:styleId="Titre2">
     <w:name w:val="heading 2"/>
     <w:basedOn w:val="Normal"/>
     <w:next w:val="Normal"/>
-    <w:link w:val="Heading2Char"/>
+    <w:link w:val="Titre2Car"/>
     <w:uiPriority w:val="9"/>
     <w:unhideWhenUsed/>
     <w:qFormat/>
@@ -6348,11 +5833,11 @@
       <w:szCs w:val="26"/>
     </w:rPr>
   </w:style>
-  <w:style w:type="paragraph" w:styleId="Heading3">
+  <w:style w:type="paragraph" w:styleId="Titre3">
     <w:name w:val="heading 3"/>
     <w:basedOn w:val="Normal"/>
     <w:next w:val="Normal"/>
-    <w:link w:val="Heading3Char"/>
+    <w:link w:val="Titre3Car"/>
     <w:uiPriority w:val="9"/>
     <w:unhideWhenUsed/>
     <w:qFormat/>
@@ -6370,11 +5855,11 @@
       <w:color w:val="4F81BD" w:themeColor="accent1"/>
     </w:rPr>
   </w:style>
-  <w:style w:type="paragraph" w:styleId="Heading4">
+  <w:style w:type="paragraph" w:styleId="Titre4">
     <w:name w:val="heading 4"/>
     <w:basedOn w:val="Normal"/>
     <w:next w:val="Normal"/>
-    <w:link w:val="Heading4Char"/>
+    <w:link w:val="Titre4Car"/>
     <w:uiPriority w:val="9"/>
     <w:semiHidden/>
     <w:unhideWhenUsed/>
@@ -6395,11 +5880,11 @@
       <w:color w:val="4F81BD" w:themeColor="accent1"/>
     </w:rPr>
   </w:style>
-  <w:style w:type="paragraph" w:styleId="Heading5">
+  <w:style w:type="paragraph" w:styleId="Titre5">
     <w:name w:val="heading 5"/>
     <w:basedOn w:val="Normal"/>
     <w:next w:val="Normal"/>
-    <w:link w:val="Heading5Char"/>
+    <w:link w:val="Titre5Car"/>
     <w:uiPriority w:val="9"/>
     <w:semiHidden/>
     <w:unhideWhenUsed/>
@@ -6416,11 +5901,11 @@
       <w:color w:val="243F60" w:themeColor="accent1" w:themeShade="7F"/>
     </w:rPr>
   </w:style>
-  <w:style w:type="paragraph" w:styleId="Heading6">
+  <w:style w:type="paragraph" w:styleId="Titre6">
     <w:name w:val="heading 6"/>
     <w:basedOn w:val="Normal"/>
     <w:next w:val="Normal"/>
-    <w:link w:val="Heading6Char"/>
+    <w:link w:val="Titre6Car"/>
     <w:uiPriority w:val="9"/>
     <w:semiHidden/>
     <w:unhideWhenUsed/>
@@ -6439,11 +5924,11 @@
       <w:color w:val="243F60" w:themeColor="accent1" w:themeShade="7F"/>
     </w:rPr>
   </w:style>
-  <w:style w:type="paragraph" w:styleId="Heading7">
+  <w:style w:type="paragraph" w:styleId="Titre7">
     <w:name w:val="heading 7"/>
     <w:basedOn w:val="Normal"/>
     <w:next w:val="Normal"/>
-    <w:link w:val="Heading7Char"/>
+    <w:link w:val="Titre7Car"/>
     <w:uiPriority w:val="9"/>
     <w:semiHidden/>
     <w:unhideWhenUsed/>
@@ -6462,11 +5947,11 @@
       <w:color w:val="404040" w:themeColor="text1" w:themeTint="BF"/>
     </w:rPr>
   </w:style>
-  <w:style w:type="paragraph" w:styleId="Heading8">
+  <w:style w:type="paragraph" w:styleId="Titre8">
     <w:name w:val="heading 8"/>
     <w:basedOn w:val="Normal"/>
     <w:next w:val="Normal"/>
-    <w:link w:val="Heading8Char"/>
+    <w:link w:val="Titre8Car"/>
     <w:uiPriority w:val="9"/>
     <w:semiHidden/>
     <w:unhideWhenUsed/>
@@ -6484,11 +5969,11 @@
       <w:szCs w:val="20"/>
     </w:rPr>
   </w:style>
-  <w:style w:type="paragraph" w:styleId="Heading9">
+  <w:style w:type="paragraph" w:styleId="Titre9">
     <w:name w:val="heading 9"/>
     <w:basedOn w:val="Normal"/>
     <w:next w:val="Normal"/>
-    <w:link w:val="Heading9Char"/>
+    <w:link w:val="Titre9Car"/>
     <w:uiPriority w:val="9"/>
     <w:semiHidden/>
     <w:unhideWhenUsed/>
@@ -6508,13 +5993,13 @@
       <w:szCs w:val="20"/>
     </w:rPr>
   </w:style>
-  <w:style w:type="character" w:default="1" w:styleId="DefaultParagraphFont">
+  <w:style w:type="character" w:default="1" w:styleId="Policepardfaut">
     <w:name w:val="Default Paragraph Font"/>
     <w:uiPriority w:val="1"/>
     <w:semiHidden/>
     <w:unhideWhenUsed/>
   </w:style>
-  <w:style w:type="table" w:default="1" w:styleId="TableNormal">
+  <w:style w:type="table" w:default="1" w:styleId="TableauNormal">
     <w:name w:val="Normal Table"/>
     <w:uiPriority w:val="99"/>
     <w:semiHidden/>
@@ -6529,16 +6014,16 @@
       </w:tblCellMar>
     </w:tblPr>
   </w:style>
-  <w:style w:type="numbering" w:default="1" w:styleId="NoList">
+  <w:style w:type="numbering" w:default="1" w:styleId="Aucuneliste">
     <w:name w:val="No List"/>
     <w:uiPriority w:val="99"/>
     <w:semiHidden/>
     <w:unhideWhenUsed/>
   </w:style>
-  <w:style w:type="paragraph" w:styleId="Header">
+  <w:style w:type="paragraph" w:styleId="En-tte">
     <w:name w:val="header"/>
     <w:basedOn w:val="Normal"/>
-    <w:link w:val="HeaderChar"/>
+    <w:link w:val="En-tteCar"/>
     <w:uiPriority w:val="99"/>
     <w:unhideWhenUsed/>
     <w:rsid w:val="00E618BF"/>
@@ -6550,17 +6035,17 @@
       <w:spacing w:after="0" w:line="240" w:lineRule="auto"/>
     </w:pPr>
   </w:style>
-  <w:style w:type="character" w:customStyle="1" w:styleId="HeaderChar">
-    <w:name w:val="Header Char"/>
-    <w:basedOn w:val="DefaultParagraphFont"/>
-    <w:link w:val="Header"/>
+  <w:style w:type="character" w:customStyle="1" w:styleId="En-tteCar">
+    <w:name w:val="En-tête Car"/>
+    <w:basedOn w:val="Policepardfaut"/>
+    <w:link w:val="En-tte"/>
     <w:uiPriority w:val="99"/>
     <w:rsid w:val="00E618BF"/>
   </w:style>
-  <w:style w:type="paragraph" w:styleId="Footer">
+  <w:style w:type="paragraph" w:styleId="Pieddepage">
     <w:name w:val="footer"/>
     <w:basedOn w:val="Normal"/>
-    <w:link w:val="FooterChar"/>
+    <w:link w:val="PieddepageCar"/>
     <w:uiPriority w:val="99"/>
     <w:unhideWhenUsed/>
     <w:rsid w:val="00E618BF"/>
@@ -6572,14 +6057,14 @@
       <w:spacing w:after="0" w:line="240" w:lineRule="auto"/>
     </w:pPr>
   </w:style>
-  <w:style w:type="character" w:customStyle="1" w:styleId="FooterChar">
-    <w:name w:val="Footer Char"/>
-    <w:basedOn w:val="DefaultParagraphFont"/>
-    <w:link w:val="Footer"/>
+  <w:style w:type="character" w:customStyle="1" w:styleId="PieddepageCar">
+    <w:name w:val="Pied de page Car"/>
+    <w:basedOn w:val="Policepardfaut"/>
+    <w:link w:val="Pieddepage"/>
     <w:uiPriority w:val="99"/>
     <w:rsid w:val="00E618BF"/>
   </w:style>
-  <w:style w:type="paragraph" w:styleId="NoSpacing">
+  <w:style w:type="paragraph" w:styleId="Sansinterligne">
     <w:name w:val="No Spacing"/>
     <w:uiPriority w:val="1"/>
     <w:qFormat/>
@@ -6588,10 +6073,10 @@
       <w:spacing w:after="0" w:line="240" w:lineRule="auto"/>
     </w:pPr>
   </w:style>
-  <w:style w:type="character" w:customStyle="1" w:styleId="Heading1Char">
-    <w:name w:val="Heading 1 Char"/>
-    <w:basedOn w:val="DefaultParagraphFont"/>
-    <w:link w:val="Heading1"/>
+  <w:style w:type="character" w:customStyle="1" w:styleId="Titre1Car">
+    <w:name w:val="Titre 1 Car"/>
+    <w:basedOn w:val="Policepardfaut"/>
+    <w:link w:val="Titre1"/>
     <w:uiPriority w:val="9"/>
     <w:rsid w:val="00FC693F"/>
     <w:rPr>
@@ -6603,10 +6088,10 @@
       <w:szCs w:val="28"/>
     </w:rPr>
   </w:style>
-  <w:style w:type="character" w:customStyle="1" w:styleId="Heading2Char">
-    <w:name w:val="Heading 2 Char"/>
-    <w:basedOn w:val="DefaultParagraphFont"/>
-    <w:link w:val="Heading2"/>
+  <w:style w:type="character" w:customStyle="1" w:styleId="Titre2Car">
+    <w:name w:val="Titre 2 Car"/>
+    <w:basedOn w:val="Policepardfaut"/>
+    <w:link w:val="Titre2"/>
     <w:uiPriority w:val="9"/>
     <w:rsid w:val="00FC693F"/>
     <w:rPr>
@@ -6618,10 +6103,10 @@
       <w:szCs w:val="26"/>
     </w:rPr>
   </w:style>
-  <w:style w:type="character" w:customStyle="1" w:styleId="Heading3Char">
-    <w:name w:val="Heading 3 Char"/>
-    <w:basedOn w:val="DefaultParagraphFont"/>
-    <w:link w:val="Heading3"/>
+  <w:style w:type="character" w:customStyle="1" w:styleId="Titre3Car">
+    <w:name w:val="Titre 3 Car"/>
+    <w:basedOn w:val="Policepardfaut"/>
+    <w:link w:val="Titre3"/>
     <w:uiPriority w:val="9"/>
     <w:rsid w:val="00FC693F"/>
     <w:rPr>
@@ -6631,11 +6116,11 @@
       <w:color w:val="4F81BD" w:themeColor="accent1"/>
     </w:rPr>
   </w:style>
-  <w:style w:type="paragraph" w:styleId="Title">
+  <w:style w:type="paragraph" w:styleId="Titre">
     <w:name w:val="Title"/>
     <w:basedOn w:val="Normal"/>
     <w:next w:val="Normal"/>
-    <w:link w:val="TitleChar"/>
+    <w:link w:val="TitreCar"/>
     <w:uiPriority w:val="10"/>
     <w:qFormat/>
     <w:rsid w:val="00FC693F"/>
@@ -6655,10 +6140,10 @@
       <w:szCs w:val="52"/>
     </w:rPr>
   </w:style>
-  <w:style w:type="character" w:customStyle="1" w:styleId="TitleChar">
-    <w:name w:val="Title Char"/>
-    <w:basedOn w:val="DefaultParagraphFont"/>
-    <w:link w:val="Title"/>
+  <w:style w:type="character" w:customStyle="1" w:styleId="TitreCar">
+    <w:name w:val="Titre Car"/>
+    <w:basedOn w:val="Policepardfaut"/>
+    <w:link w:val="Titre"/>
     <w:uiPriority w:val="10"/>
     <w:rsid w:val="00FC693F"/>
     <w:rPr>
@@ -6670,11 +6155,11 @@
       <w:szCs w:val="52"/>
     </w:rPr>
   </w:style>
-  <w:style w:type="paragraph" w:styleId="Subtitle">
+  <w:style w:type="paragraph" w:styleId="Sous-titre">
     <w:name w:val="Subtitle"/>
     <w:basedOn w:val="Normal"/>
     <w:next w:val="Normal"/>
-    <w:link w:val="SubtitleChar"/>
+    <w:link w:val="Sous-titreCar"/>
     <w:uiPriority w:val="11"/>
     <w:qFormat/>
     <w:rsid w:val="00FC693F"/>
@@ -6693,10 +6178,10 @@
       <w:szCs w:val="24"/>
     </w:rPr>
   </w:style>
-  <w:style w:type="character" w:customStyle="1" w:styleId="SubtitleChar">
-    <w:name w:val="Subtitle Char"/>
-    <w:basedOn w:val="DefaultParagraphFont"/>
-    <w:link w:val="Subtitle"/>
+  <w:style w:type="character" w:customStyle="1" w:styleId="Sous-titreCar">
+    <w:name w:val="Sous-titre Car"/>
+    <w:basedOn w:val="Policepardfaut"/>
+    <w:link w:val="Sous-titre"/>
     <w:uiPriority w:val="11"/>
     <w:rsid w:val="00FC693F"/>
     <w:rPr>
@@ -6709,7 +6194,7 @@
       <w:szCs w:val="24"/>
     </w:rPr>
   </w:style>
-  <w:style w:type="paragraph" w:styleId="ListParagraph">
+  <w:style w:type="paragraph" w:styleId="Paragraphedeliste">
     <w:name w:val="List Paragraph"/>
     <w:basedOn w:val="Normal"/>
     <w:uiPriority w:val="34"/>
@@ -6720,10 +6205,10 @@
       <w:contextualSpacing/>
     </w:pPr>
   </w:style>
-  <w:style w:type="paragraph" w:styleId="BodyText">
+  <w:style w:type="paragraph" w:styleId="Corpsdetexte">
     <w:name w:val="Body Text"/>
     <w:basedOn w:val="Normal"/>
-    <w:link w:val="BodyTextChar"/>
+    <w:link w:val="CorpsdetexteCar"/>
     <w:uiPriority w:val="99"/>
     <w:unhideWhenUsed/>
     <w:rsid w:val="00AA1D8D"/>
@@ -6731,17 +6216,17 @@
       <w:spacing w:after="120"/>
     </w:pPr>
   </w:style>
-  <w:style w:type="character" w:customStyle="1" w:styleId="BodyTextChar">
-    <w:name w:val="Body Text Char"/>
-    <w:basedOn w:val="DefaultParagraphFont"/>
-    <w:link w:val="BodyText"/>
+  <w:style w:type="character" w:customStyle="1" w:styleId="CorpsdetexteCar">
+    <w:name w:val="Corps de texte Car"/>
+    <w:basedOn w:val="Policepardfaut"/>
+    <w:link w:val="Corpsdetexte"/>
     <w:uiPriority w:val="99"/>
     <w:rsid w:val="00AA1D8D"/>
   </w:style>
-  <w:style w:type="paragraph" w:styleId="BodyText2">
+  <w:style w:type="paragraph" w:styleId="Corpsdetexte2">
     <w:name w:val="Body Text 2"/>
     <w:basedOn w:val="Normal"/>
-    <w:link w:val="BodyText2Char"/>
+    <w:link w:val="Corpsdetexte2Car"/>
     <w:uiPriority w:val="99"/>
     <w:unhideWhenUsed/>
     <w:rsid w:val="00AA1D8D"/>
@@ -6749,17 +6234,17 @@
       <w:spacing w:after="120" w:line="480" w:lineRule="auto"/>
     </w:pPr>
   </w:style>
-  <w:style w:type="character" w:customStyle="1" w:styleId="BodyText2Char">
-    <w:name w:val="Body Text 2 Char"/>
-    <w:basedOn w:val="DefaultParagraphFont"/>
-    <w:link w:val="BodyText2"/>
+  <w:style w:type="character" w:customStyle="1" w:styleId="Corpsdetexte2Car">
+    <w:name w:val="Corps de texte 2 Car"/>
+    <w:basedOn w:val="Policepardfaut"/>
+    <w:link w:val="Corpsdetexte2"/>
     <w:uiPriority w:val="99"/>
     <w:rsid w:val="00AA1D8D"/>
   </w:style>
-  <w:style w:type="paragraph" w:styleId="BodyText3">
+  <w:style w:type="paragraph" w:styleId="Corpsdetexte3">
     <w:name w:val="Body Text 3"/>
     <w:basedOn w:val="Normal"/>
-    <w:link w:val="BodyText3Char"/>
+    <w:link w:val="Corpsdetexte3Car"/>
     <w:uiPriority w:val="99"/>
     <w:unhideWhenUsed/>
     <w:rsid w:val="00AA1D8D"/>
@@ -6771,10 +6256,10 @@
       <w:szCs w:val="16"/>
     </w:rPr>
   </w:style>
-  <w:style w:type="character" w:customStyle="1" w:styleId="BodyText3Char">
-    <w:name w:val="Body Text 3 Char"/>
-    <w:basedOn w:val="DefaultParagraphFont"/>
-    <w:link w:val="BodyText3"/>
+  <w:style w:type="character" w:customStyle="1" w:styleId="Corpsdetexte3Car">
+    <w:name w:val="Corps de texte 3 Car"/>
+    <w:basedOn w:val="Policepardfaut"/>
+    <w:link w:val="Corpsdetexte3"/>
     <w:uiPriority w:val="99"/>
     <w:rsid w:val="00AA1D8D"/>
     <w:rPr>
@@ -6782,7 +6267,7 @@
       <w:szCs w:val="16"/>
     </w:rPr>
   </w:style>
-  <w:style w:type="paragraph" w:styleId="List">
+  <w:style w:type="paragraph" w:styleId="Liste">
     <w:name w:val="List"/>
     <w:basedOn w:val="Normal"/>
     <w:uiPriority w:val="99"/>
@@ -6793,7 +6278,7 @@
       <w:contextualSpacing/>
     </w:pPr>
   </w:style>
-  <w:style w:type="paragraph" w:styleId="List2">
+  <w:style w:type="paragraph" w:styleId="Liste2">
     <w:name w:val="List 2"/>
     <w:basedOn w:val="Normal"/>
     <w:uiPriority w:val="99"/>
@@ -6804,7 +6289,7 @@
       <w:contextualSpacing/>
     </w:pPr>
   </w:style>
-  <w:style w:type="paragraph" w:styleId="List3">
+  <w:style w:type="paragraph" w:styleId="Liste3">
     <w:name w:val="List 3"/>
     <w:basedOn w:val="Normal"/>
     <w:uiPriority w:val="99"/>
@@ -6815,7 +6300,7 @@
       <w:contextualSpacing/>
     </w:pPr>
   </w:style>
-  <w:style w:type="paragraph" w:styleId="ListBullet">
+  <w:style w:type="paragraph" w:styleId="Listepuces">
     <w:name w:val="List Bullet"/>
     <w:basedOn w:val="Normal"/>
     <w:uiPriority w:val="99"/>
@@ -6828,7 +6313,7 @@
       <w:contextualSpacing/>
     </w:pPr>
   </w:style>
-  <w:style w:type="paragraph" w:styleId="ListBullet2">
+  <w:style w:type="paragraph" w:styleId="Listepuces2">
     <w:name w:val="List Bullet 2"/>
     <w:basedOn w:val="Normal"/>
     <w:uiPriority w:val="99"/>
@@ -6841,7 +6326,7 @@
       <w:contextualSpacing/>
     </w:pPr>
   </w:style>
-  <w:style w:type="paragraph" w:styleId="ListBullet3">
+  <w:style w:type="paragraph" w:styleId="Listepuces3">
     <w:name w:val="List Bullet 3"/>
     <w:basedOn w:val="Normal"/>
     <w:uiPriority w:val="99"/>
@@ -6854,7 +6339,7 @@
       <w:contextualSpacing/>
     </w:pPr>
   </w:style>
-  <w:style w:type="paragraph" w:styleId="ListNumber">
+  <w:style w:type="paragraph" w:styleId="Listenumros">
     <w:name w:val="List Number"/>
     <w:basedOn w:val="Normal"/>
     <w:uiPriority w:val="99"/>
@@ -6867,7 +6352,7 @@
       <w:contextualSpacing/>
     </w:pPr>
   </w:style>
-  <w:style w:type="paragraph" w:styleId="ListNumber2">
+  <w:style w:type="paragraph" w:styleId="Listenumros2">
     <w:name w:val="List Number 2"/>
     <w:basedOn w:val="Normal"/>
     <w:uiPriority w:val="99"/>
@@ -6880,7 +6365,7 @@
       <w:contextualSpacing/>
     </w:pPr>
   </w:style>
-  <w:style w:type="paragraph" w:styleId="ListNumber3">
+  <w:style w:type="paragraph" w:styleId="Listenumros3">
     <w:name w:val="List Number 3"/>
     <w:basedOn w:val="Normal"/>
     <w:uiPriority w:val="99"/>
@@ -6893,7 +6378,7 @@
       <w:contextualSpacing/>
     </w:pPr>
   </w:style>
-  <w:style w:type="paragraph" w:styleId="ListContinue">
+  <w:style w:type="paragraph" w:styleId="Listecontinue">
     <w:name w:val="List Continue"/>
     <w:basedOn w:val="Normal"/>
     <w:uiPriority w:val="99"/>
@@ -6905,7 +6390,7 @@
       <w:contextualSpacing/>
     </w:pPr>
   </w:style>
-  <w:style w:type="paragraph" w:styleId="ListContinue2">
+  <w:style w:type="paragraph" w:styleId="Listecontinue2">
     <w:name w:val="List Continue 2"/>
     <w:basedOn w:val="Normal"/>
     <w:uiPriority w:val="99"/>
@@ -6917,7 +6402,7 @@
       <w:contextualSpacing/>
     </w:pPr>
   </w:style>
-  <w:style w:type="paragraph" w:styleId="ListContinue3">
+  <w:style w:type="paragraph" w:styleId="Listecontinue3">
     <w:name w:val="List Continue 3"/>
     <w:basedOn w:val="Normal"/>
     <w:uiPriority w:val="99"/>
@@ -6929,9 +6414,9 @@
       <w:contextualSpacing/>
     </w:pPr>
   </w:style>
-  <w:style w:type="paragraph" w:styleId="MacroText">
+  <w:style w:type="paragraph" w:styleId="Textedemacro">
     <w:name w:val="macro"/>
-    <w:link w:val="MacroTextChar"/>
+    <w:link w:val="TextedemacroCar"/>
     <w:uiPriority w:val="99"/>
     <w:unhideWhenUsed/>
     <w:rsid w:val="0029639D"/>
@@ -6952,10 +6437,10 @@
       <w:szCs w:val="20"/>
     </w:rPr>
   </w:style>
-  <w:style w:type="character" w:customStyle="1" w:styleId="MacroTextChar">
-    <w:name w:val="Macro Text Char"/>
-    <w:basedOn w:val="DefaultParagraphFont"/>
-    <w:link w:val="MacroText"/>
+  <w:style w:type="character" w:customStyle="1" w:styleId="TextedemacroCar">
+    <w:name w:val="Texte de macro Car"/>
+    <w:basedOn w:val="Policepardfaut"/>
+    <w:link w:val="Textedemacro"/>
     <w:uiPriority w:val="99"/>
     <w:rsid w:val="0029639D"/>
     <w:rPr>
@@ -6964,11 +6449,11 @@
       <w:szCs w:val="20"/>
     </w:rPr>
   </w:style>
-  <w:style w:type="paragraph" w:styleId="Quote">
+  <w:style w:type="paragraph" w:styleId="Citation">
     <w:name w:val="Quote"/>
     <w:basedOn w:val="Normal"/>
     <w:next w:val="Normal"/>
-    <w:link w:val="QuoteChar"/>
+    <w:link w:val="CitationCar"/>
     <w:uiPriority w:val="29"/>
     <w:qFormat/>
     <w:rsid w:val="00FC693F"/>
@@ -6978,10 +6463,10 @@
       <w:color w:val="000000" w:themeColor="text1"/>
     </w:rPr>
   </w:style>
-  <w:style w:type="character" w:customStyle="1" w:styleId="QuoteChar">
-    <w:name w:val="Quote Char"/>
-    <w:basedOn w:val="DefaultParagraphFont"/>
-    <w:link w:val="Quote"/>
+  <w:style w:type="character" w:customStyle="1" w:styleId="CitationCar">
+    <w:name w:val="Citation Car"/>
+    <w:basedOn w:val="Policepardfaut"/>
+    <w:link w:val="Citation"/>
     <w:uiPriority w:val="29"/>
     <w:rsid w:val="00FC693F"/>
     <w:rPr>
@@ -6990,10 +6475,10 @@
       <w:color w:val="000000" w:themeColor="text1"/>
     </w:rPr>
   </w:style>
-  <w:style w:type="character" w:customStyle="1" w:styleId="Heading4Char">
-    <w:name w:val="Heading 4 Char"/>
-    <w:basedOn w:val="DefaultParagraphFont"/>
-    <w:link w:val="Heading4"/>
+  <w:style w:type="character" w:customStyle="1" w:styleId="Titre4Car">
+    <w:name w:val="Titre 4 Car"/>
+    <w:basedOn w:val="Policepardfaut"/>
+    <w:link w:val="Titre4"/>
     <w:uiPriority w:val="9"/>
     <w:semiHidden/>
     <w:rsid w:val="00FC693F"/>
@@ -7006,10 +6491,10 @@
       <w:color w:val="4F81BD" w:themeColor="accent1"/>
     </w:rPr>
   </w:style>
-  <w:style w:type="character" w:customStyle="1" w:styleId="Heading5Char">
-    <w:name w:val="Heading 5 Char"/>
-    <w:basedOn w:val="DefaultParagraphFont"/>
-    <w:link w:val="Heading5"/>
+  <w:style w:type="character" w:customStyle="1" w:styleId="Titre5Car">
+    <w:name w:val="Titre 5 Car"/>
+    <w:basedOn w:val="Policepardfaut"/>
+    <w:link w:val="Titre5"/>
     <w:uiPriority w:val="9"/>
     <w:semiHidden/>
     <w:rsid w:val="00FC693F"/>
@@ -7018,10 +6503,10 @@
       <w:color w:val="243F60" w:themeColor="accent1" w:themeShade="7F"/>
     </w:rPr>
   </w:style>
-  <w:style w:type="character" w:customStyle="1" w:styleId="Heading6Char">
-    <w:name w:val="Heading 6 Char"/>
-    <w:basedOn w:val="DefaultParagraphFont"/>
-    <w:link w:val="Heading6"/>
+  <w:style w:type="character" w:customStyle="1" w:styleId="Titre6Car">
+    <w:name w:val="Titre 6 Car"/>
+    <w:basedOn w:val="Policepardfaut"/>
+    <w:link w:val="Titre6"/>
     <w:uiPriority w:val="9"/>
     <w:semiHidden/>
     <w:rsid w:val="00FC693F"/>
@@ -7032,10 +6517,10 @@
       <w:color w:val="243F60" w:themeColor="accent1" w:themeShade="7F"/>
     </w:rPr>
   </w:style>
-  <w:style w:type="character" w:customStyle="1" w:styleId="Heading7Char">
-    <w:name w:val="Heading 7 Char"/>
-    <w:basedOn w:val="DefaultParagraphFont"/>
-    <w:link w:val="Heading7"/>
+  <w:style w:type="character" w:customStyle="1" w:styleId="Titre7Car">
+    <w:name w:val="Titre 7 Car"/>
+    <w:basedOn w:val="Policepardfaut"/>
+    <w:link w:val="Titre7"/>
     <w:uiPriority w:val="9"/>
     <w:semiHidden/>
     <w:rsid w:val="00FC693F"/>
@@ -7046,10 +6531,10 @@
       <w:color w:val="404040" w:themeColor="text1" w:themeTint="BF"/>
     </w:rPr>
   </w:style>
-  <w:style w:type="character" w:customStyle="1" w:styleId="Heading8Char">
-    <w:name w:val="Heading 8 Char"/>
-    <w:basedOn w:val="DefaultParagraphFont"/>
-    <w:link w:val="Heading8"/>
+  <w:style w:type="character" w:customStyle="1" w:styleId="Titre8Car">
+    <w:name w:val="Titre 8 Car"/>
+    <w:basedOn w:val="Policepardfaut"/>
+    <w:link w:val="Titre8"/>
     <w:uiPriority w:val="9"/>
     <w:semiHidden/>
     <w:rsid w:val="00FC693F"/>
@@ -7060,10 +6545,10 @@
       <w:szCs w:val="20"/>
     </w:rPr>
   </w:style>
-  <w:style w:type="character" w:customStyle="1" w:styleId="Heading9Char">
-    <w:name w:val="Heading 9 Char"/>
-    <w:basedOn w:val="DefaultParagraphFont"/>
-    <w:link w:val="Heading9"/>
+  <w:style w:type="character" w:customStyle="1" w:styleId="Titre9Car">
+    <w:name w:val="Titre 9 Car"/>
+    <w:basedOn w:val="Policepardfaut"/>
+    <w:link w:val="Titre9"/>
     <w:uiPriority w:val="9"/>
     <w:semiHidden/>
     <w:rsid w:val="00FC693F"/>
@@ -7076,7 +6561,7 @@
       <w:szCs w:val="20"/>
     </w:rPr>
   </w:style>
-  <w:style w:type="paragraph" w:styleId="Caption">
+  <w:style w:type="paragraph" w:styleId="Lgende">
     <w:name w:val="caption"/>
     <w:basedOn w:val="Normal"/>
     <w:next w:val="Normal"/>
@@ -7096,9 +6581,9 @@
       <w:szCs w:val="18"/>
     </w:rPr>
   </w:style>
-  <w:style w:type="character" w:styleId="Strong">
+  <w:style w:type="character" w:styleId="lev">
     <w:name w:val="Strong"/>
-    <w:basedOn w:val="DefaultParagraphFont"/>
+    <w:basedOn w:val="Policepardfaut"/>
     <w:uiPriority w:val="22"/>
     <w:qFormat/>
     <w:rsid w:val="00FC693F"/>
@@ -7107,9 +6592,9 @@
       <w:bCs/>
     </w:rPr>
   </w:style>
-  <w:style w:type="character" w:styleId="Emphasis">
+  <w:style w:type="character" w:styleId="Accentuation">
     <w:name w:val="Emphasis"/>
-    <w:basedOn w:val="DefaultParagraphFont"/>
+    <w:basedOn w:val="Policepardfaut"/>
     <w:uiPriority w:val="20"/>
     <w:qFormat/>
     <w:rsid w:val="00FC693F"/>
@@ -7118,11 +6603,11 @@
       <w:iCs/>
     </w:rPr>
   </w:style>
-  <w:style w:type="paragraph" w:styleId="IntenseQuote">
+  <w:style w:type="paragraph" w:styleId="Citationintense">
     <w:name w:val="Intense Quote"/>
     <w:basedOn w:val="Normal"/>
     <w:next w:val="Normal"/>
-    <w:link w:val="IntenseQuoteChar"/>
+    <w:link w:val="CitationintenseCar"/>
     <w:uiPriority w:val="30"/>
     <w:qFormat/>
     <w:rsid w:val="00FC693F"/>
@@ -7141,10 +6626,10 @@
       <w:color w:val="4F81BD" w:themeColor="accent1"/>
     </w:rPr>
   </w:style>
-  <w:style w:type="character" w:customStyle="1" w:styleId="IntenseQuoteChar">
-    <w:name w:val="Intense Quote Char"/>
-    <w:basedOn w:val="DefaultParagraphFont"/>
-    <w:link w:val="IntenseQuote"/>
+  <w:style w:type="character" w:customStyle="1" w:styleId="CitationintenseCar">
+    <w:name w:val="Citation intense Car"/>
+    <w:basedOn w:val="Policepardfaut"/>
+    <w:link w:val="Citationintense"/>
     <w:uiPriority w:val="30"/>
     <w:rsid w:val="00FC693F"/>
     <w:rPr>
@@ -7155,9 +6640,9 @@
       <w:color w:val="4F81BD" w:themeColor="accent1"/>
     </w:rPr>
   </w:style>
-  <w:style w:type="character" w:styleId="SubtleEmphasis">
+  <w:style w:type="character" w:styleId="Accentuationlgre">
     <w:name w:val="Subtle Emphasis"/>
-    <w:basedOn w:val="DefaultParagraphFont"/>
+    <w:basedOn w:val="Policepardfaut"/>
     <w:uiPriority w:val="19"/>
     <w:qFormat/>
     <w:rsid w:val="00FC693F"/>
@@ -7167,9 +6652,9 @@
       <w:color w:val="808080" w:themeColor="text1" w:themeTint="7F"/>
     </w:rPr>
   </w:style>
-  <w:style w:type="character" w:styleId="IntenseEmphasis">
+  <w:style w:type="character" w:styleId="Accentuationintense">
     <w:name w:val="Intense Emphasis"/>
-    <w:basedOn w:val="DefaultParagraphFont"/>
+    <w:basedOn w:val="Policepardfaut"/>
     <w:uiPriority w:val="21"/>
     <w:qFormat/>
     <w:rsid w:val="00FC693F"/>
@@ -7181,9 +6666,9 @@
       <w:color w:val="4F81BD" w:themeColor="accent1"/>
     </w:rPr>
   </w:style>
-  <w:style w:type="character" w:styleId="SubtleReference">
+  <w:style w:type="character" w:styleId="Rfrencelgre">
     <w:name w:val="Subtle Reference"/>
-    <w:basedOn w:val="DefaultParagraphFont"/>
+    <w:basedOn w:val="Policepardfaut"/>
     <w:uiPriority w:val="31"/>
     <w:qFormat/>
     <w:rsid w:val="00FC693F"/>
@@ -7193,9 +6678,9 @@
       <w:u w:val="single"/>
     </w:rPr>
   </w:style>
-  <w:style w:type="character" w:styleId="IntenseReference">
+  <w:style w:type="character" w:styleId="Rfrenceintense">
     <w:name w:val="Intense Reference"/>
-    <w:basedOn w:val="DefaultParagraphFont"/>
+    <w:basedOn w:val="Policepardfaut"/>
     <w:uiPriority w:val="32"/>
     <w:qFormat/>
     <w:rsid w:val="00FC693F"/>
@@ -7208,9 +6693,9 @@
       <w:u w:val="single"/>
     </w:rPr>
   </w:style>
-  <w:style w:type="character" w:styleId="BookTitle">
+  <w:style w:type="character" w:styleId="Titredulivre">
     <w:name w:val="Book Title"/>
-    <w:basedOn w:val="DefaultParagraphFont"/>
+    <w:basedOn w:val="Policepardfaut"/>
     <w:uiPriority w:val="33"/>
     <w:qFormat/>
     <w:rsid w:val="00FC693F"/>
@@ -7221,9 +6706,9 @@
       <w:spacing w:val="5"/>
     </w:rPr>
   </w:style>
-  <w:style w:type="paragraph" w:styleId="TOCHeading">
+  <w:style w:type="paragraph" w:styleId="En-ttedetabledesmatires">
     <w:name w:val="TOC Heading"/>
-    <w:basedOn w:val="Heading1"/>
+    <w:basedOn w:val="Titre1"/>
     <w:next w:val="Normal"/>
     <w:uiPriority w:val="39"/>
     <w:semiHidden/>
@@ -7234,9 +6719,9 @@
       <w:outlineLvl w:val="9"/>
     </w:pPr>
   </w:style>
-  <w:style w:type="table" w:styleId="TableGrid">
+  <w:style w:type="table" w:styleId="Grilledutableau">
     <w:name w:val="Table Grid"/>
-    <w:basedOn w:val="TableNormal"/>
+    <w:basedOn w:val="TableauNormal"/>
     <w:uiPriority w:val="59"/>
     <w:rsid w:val="00FC693F"/>
     <w:pPr>
@@ -7253,9 +6738,9 @@
       </w:tblBorders>
     </w:tblPr>
   </w:style>
-  <w:style w:type="table" w:styleId="LightShading">
+  <w:style w:type="table" w:styleId="Ombrageclair">
     <w:name w:val="Light Shading"/>
-    <w:basedOn w:val="TableNormal"/>
+    <w:basedOn w:val="TableauNormal"/>
     <w:uiPriority w:val="60"/>
     <w:rsid w:val="00FC693F"/>
     <w:pPr>
@@ -7349,9 +6834,9 @@
       </w:tcPr>
     </w:tblStylePr>
   </w:style>
-  <w:style w:type="table" w:styleId="LightShading-Accent1">
+  <w:style w:type="table" w:styleId="Trameclaire-Accent1">
     <w:name w:val="Light Shading Accent 1"/>
-    <w:basedOn w:val="TableNormal"/>
+    <w:basedOn w:val="TableauNormal"/>
     <w:uiPriority w:val="60"/>
     <w:rsid w:val="00FC693F"/>
     <w:pPr>
@@ -7445,9 +6930,9 @@
       </w:tcPr>
     </w:tblStylePr>
   </w:style>
-  <w:style w:type="table" w:styleId="LightShading-Accent2">
+  <w:style w:type="table" w:styleId="Trameclaire-Accent2">
     <w:name w:val="Light Shading Accent 2"/>
-    <w:basedOn w:val="TableNormal"/>
+    <w:basedOn w:val="TableauNormal"/>
     <w:uiPriority w:val="60"/>
     <w:rsid w:val="00FC693F"/>
     <w:pPr>
@@ -7541,9 +7026,9 @@
       </w:tcPr>
     </w:tblStylePr>
   </w:style>
-  <w:style w:type="table" w:styleId="LightShading-Accent3">
+  <w:style w:type="table" w:styleId="Trameclaire-Accent3">
     <w:name w:val="Light Shading Accent 3"/>
-    <w:basedOn w:val="TableNormal"/>
+    <w:basedOn w:val="TableauNormal"/>
     <w:uiPriority w:val="60"/>
     <w:rsid w:val="00FC693F"/>
     <w:pPr>
@@ -7637,9 +7122,9 @@
       </w:tcPr>
     </w:tblStylePr>
   </w:style>
-  <w:style w:type="table" w:styleId="LightShading-Accent4">
+  <w:style w:type="table" w:styleId="Trameclaire-Accent4">
     <w:name w:val="Light Shading Accent 4"/>
-    <w:basedOn w:val="TableNormal"/>
+    <w:basedOn w:val="TableauNormal"/>
     <w:uiPriority w:val="60"/>
     <w:rsid w:val="00FC693F"/>
     <w:pPr>
@@ -7733,9 +7218,9 @@
       </w:tcPr>
     </w:tblStylePr>
   </w:style>
-  <w:style w:type="table" w:styleId="LightShading-Accent5">
+  <w:style w:type="table" w:styleId="Trameclaire-Accent5">
     <w:name w:val="Light Shading Accent 5"/>
-    <w:basedOn w:val="TableNormal"/>
+    <w:basedOn w:val="TableauNormal"/>
     <w:uiPriority w:val="60"/>
     <w:rsid w:val="00FC693F"/>
     <w:pPr>
@@ -7829,9 +7314,9 @@
       </w:tcPr>
     </w:tblStylePr>
   </w:style>
-  <w:style w:type="table" w:styleId="LightShading-Accent6">
+  <w:style w:type="table" w:styleId="Trameclaire-Accent6">
     <w:name w:val="Light Shading Accent 6"/>
-    <w:basedOn w:val="TableNormal"/>
+    <w:basedOn w:val="TableauNormal"/>
     <w:uiPriority w:val="60"/>
     <w:rsid w:val="00FC693F"/>
     <w:pPr>
@@ -7925,9 +7410,9 @@
       </w:tcPr>
     </w:tblStylePr>
   </w:style>
-  <w:style w:type="table" w:styleId="LightList">
+  <w:style w:type="table" w:styleId="Listeclaire">
     <w:name w:val="Light List"/>
-    <w:basedOn w:val="TableNormal"/>
+    <w:basedOn w:val="TableauNormal"/>
     <w:uiPriority w:val="61"/>
     <w:rsid w:val="00FC693F"/>
     <w:pPr>
@@ -8010,9 +7495,9 @@
       </w:tcPr>
     </w:tblStylePr>
   </w:style>
-  <w:style w:type="table" w:styleId="LightList-Accent1">
+  <w:style w:type="table" w:styleId="Listeclaire-Accent1">
     <w:name w:val="Light List Accent 1"/>
-    <w:basedOn w:val="TableNormal"/>
+    <w:basedOn w:val="TableauNormal"/>
     <w:uiPriority w:val="61"/>
     <w:rsid w:val="00FC693F"/>
     <w:pPr>
@@ -8095,9 +7580,9 @@
       </w:tcPr>
     </w:tblStylePr>
   </w:style>
-  <w:style w:type="table" w:styleId="LightList-Accent2">
+  <w:style w:type="table" w:styleId="Listeclaire-Accent2">
     <w:name w:val="Light List Accent 2"/>
-    <w:basedOn w:val="TableNormal"/>
+    <w:basedOn w:val="TableauNormal"/>
     <w:uiPriority w:val="61"/>
     <w:rsid w:val="00CB0664"/>
     <w:pPr>
@@ -8180,9 +7665,9 @@
       </w:tcPr>
     </w:tblStylePr>
   </w:style>
-  <w:style w:type="table" w:styleId="LightList-Accent3">
+  <w:style w:type="table" w:styleId="Listeclaire-Accent3">
     <w:name w:val="Light List Accent 3"/>
-    <w:basedOn w:val="TableNormal"/>
+    <w:basedOn w:val="TableauNormal"/>
     <w:uiPriority w:val="61"/>
     <w:rsid w:val="00CB0664"/>
     <w:pPr>
@@ -8265,9 +7750,9 @@
       </w:tcPr>
     </w:tblStylePr>
   </w:style>
-  <w:style w:type="table" w:styleId="LightList-Accent4">
+  <w:style w:type="table" w:styleId="Listeclaire-Accent4">
     <w:name w:val="Light List Accent 4"/>
-    <w:basedOn w:val="TableNormal"/>
+    <w:basedOn w:val="TableauNormal"/>
     <w:uiPriority w:val="61"/>
     <w:rsid w:val="00CB0664"/>
     <w:pPr>
@@ -8350,9 +7835,9 @@
       </w:tcPr>
     </w:tblStylePr>
   </w:style>
-  <w:style w:type="table" w:styleId="LightList-Accent5">
+  <w:style w:type="table" w:styleId="Listeclaire-Accent5">
     <w:name w:val="Light List Accent 5"/>
-    <w:basedOn w:val="TableNormal"/>
+    <w:basedOn w:val="TableauNormal"/>
     <w:uiPriority w:val="61"/>
     <w:rsid w:val="00CB0664"/>
     <w:pPr>
@@ -8435,9 +7920,9 @@
       </w:tcPr>
     </w:tblStylePr>
   </w:style>
-  <w:style w:type="table" w:styleId="LightList-Accent6">
+  <w:style w:type="table" w:styleId="Listeclaire-Accent6">
     <w:name w:val="Light List Accent 6"/>
-    <w:basedOn w:val="TableNormal"/>
+    <w:basedOn w:val="TableauNormal"/>
     <w:uiPriority w:val="61"/>
     <w:rsid w:val="00CB0664"/>
     <w:pPr>
@@ -8520,9 +8005,9 @@
       </w:tcPr>
     </w:tblStylePr>
   </w:style>
-  <w:style w:type="table" w:styleId="LightGrid">
+  <w:style w:type="table" w:styleId="Grilleclaire">
     <w:name w:val="Light Grid"/>
-    <w:basedOn w:val="TableNormal"/>
+    <w:basedOn w:val="TableauNormal"/>
     <w:uiPriority w:val="62"/>
     <w:rsid w:val="00CB0664"/>
     <w:pPr>
@@ -8643,9 +8128,9 @@
       </w:tcPr>
     </w:tblStylePr>
   </w:style>
-  <w:style w:type="table" w:styleId="LightGrid-Accent1">
+  <w:style w:type="table" w:styleId="Grilleclaire-Accent1">
     <w:name w:val="Light Grid Accent 1"/>
-    <w:basedOn w:val="TableNormal"/>
+    <w:basedOn w:val="TableauNormal"/>
     <w:uiPriority w:val="62"/>
     <w:rsid w:val="00CB0664"/>
     <w:pPr>
@@ -8766,9 +8251,9 @@
       </w:tcPr>
     </w:tblStylePr>
   </w:style>
-  <w:style w:type="table" w:styleId="LightGrid-Accent2">
+  <w:style w:type="table" w:styleId="Grilleclaire-Accent2">
     <w:name w:val="Light Grid Accent 2"/>
-    <w:basedOn w:val="TableNormal"/>
+    <w:basedOn w:val="TableauNormal"/>
     <w:uiPriority w:val="62"/>
     <w:rsid w:val="00CB0664"/>
     <w:pPr>
@@ -8889,9 +8374,9 @@
       </w:tcPr>
     </w:tblStylePr>
   </w:style>
-  <w:style w:type="table" w:styleId="LightGrid-Accent3">
+  <w:style w:type="table" w:styleId="Grilleclaire-Accent3">
     <w:name w:val="Light Grid Accent 3"/>
-    <w:basedOn w:val="TableNormal"/>
+    <w:basedOn w:val="TableauNormal"/>
     <w:uiPriority w:val="62"/>
     <w:rsid w:val="00CB0664"/>
     <w:pPr>
@@ -9012,9 +8497,9 @@
       </w:tcPr>
     </w:tblStylePr>
   </w:style>
-  <w:style w:type="table" w:styleId="LightGrid-Accent4">
+  <w:style w:type="table" w:styleId="Grilleclaire-Accent4">
     <w:name w:val="Light Grid Accent 4"/>
-    <w:basedOn w:val="TableNormal"/>
+    <w:basedOn w:val="TableauNormal"/>
     <w:uiPriority w:val="62"/>
     <w:rsid w:val="00CB0664"/>
     <w:pPr>
@@ -9135,9 +8620,9 @@
       </w:tcPr>
     </w:tblStylePr>
   </w:style>
-  <w:style w:type="table" w:styleId="LightGrid-Accent5">
+  <w:style w:type="table" w:styleId="Grilleclaire-Accent5">
     <w:name w:val="Light Grid Accent 5"/>
-    <w:basedOn w:val="TableNormal"/>
+    <w:basedOn w:val="TableauNormal"/>
     <w:uiPriority w:val="62"/>
     <w:rsid w:val="00CB0664"/>
     <w:pPr>
@@ -9258,9 +8743,9 @@
       </w:tcPr>
     </w:tblStylePr>
   </w:style>
-  <w:style w:type="table" w:styleId="LightGrid-Accent6">
+  <w:style w:type="table" w:styleId="Grilleclaire-Accent6">
     <w:name w:val="Light Grid Accent 6"/>
-    <w:basedOn w:val="TableNormal"/>
+    <w:basedOn w:val="TableauNormal"/>
     <w:uiPriority w:val="62"/>
     <w:rsid w:val="00CB0664"/>
     <w:pPr>
@@ -9381,9 +8866,9 @@
       </w:tcPr>
     </w:tblStylePr>
   </w:style>
-  <w:style w:type="table" w:styleId="MediumShading1">
+  <w:style w:type="table" w:styleId="Tramemoyenne1">
     <w:name w:val="Medium Shading 1"/>
-    <w:basedOn w:val="TableNormal"/>
+    <w:basedOn w:val="TableauNormal"/>
     <w:uiPriority w:val="63"/>
     <w:rsid w:val="00CB0664"/>
     <w:pPr>
@@ -9480,9 +8965,9 @@
       </w:tcPr>
     </w:tblStylePr>
   </w:style>
-  <w:style w:type="table" w:styleId="MediumShading1-Accent1">
+  <w:style w:type="table" w:styleId="Tramemoyenne1-Accent1">
     <w:name w:val="Medium Shading 1 Accent 1"/>
-    <w:basedOn w:val="TableNormal"/>
+    <w:basedOn w:val="TableauNormal"/>
     <w:uiPriority w:val="63"/>
     <w:rsid w:val="00CB0664"/>
     <w:pPr>
@@ -9579,9 +9064,9 @@
       </w:tcPr>
     </w:tblStylePr>
   </w:style>
-  <w:style w:type="table" w:styleId="MediumShading1-Accent2">
+  <w:style w:type="table" w:styleId="Tramemoyenne1-Accent2">
     <w:name w:val="Medium Shading 1 Accent 2"/>
-    <w:basedOn w:val="TableNormal"/>
+    <w:basedOn w:val="TableauNormal"/>
     <w:uiPriority w:val="63"/>
     <w:rsid w:val="00CB0664"/>
     <w:pPr>
@@ -9678,9 +9163,9 @@
       </w:tcPr>
     </w:tblStylePr>
   </w:style>
-  <w:style w:type="table" w:styleId="MediumShading1-Accent3">
+  <w:style w:type="table" w:styleId="Tramemoyenne1-Accent3">
     <w:name w:val="Medium Shading 1 Accent 3"/>
-    <w:basedOn w:val="TableNormal"/>
+    <w:basedOn w:val="TableauNormal"/>
     <w:uiPriority w:val="63"/>
     <w:rsid w:val="00CB0664"/>
     <w:pPr>
@@ -9777,9 +9262,9 @@
       </w:tcPr>
     </w:tblStylePr>
   </w:style>
-  <w:style w:type="table" w:styleId="MediumShading1-Accent4">
+  <w:style w:type="table" w:styleId="Tramemoyenne1-Accent4">
     <w:name w:val="Medium Shading 1 Accent 4"/>
-    <w:basedOn w:val="TableNormal"/>
+    <w:basedOn w:val="TableauNormal"/>
     <w:uiPriority w:val="63"/>
     <w:rsid w:val="00CB0664"/>
     <w:pPr>
@@ -9876,9 +9361,9 @@
       </w:tcPr>
     </w:tblStylePr>
   </w:style>
-  <w:style w:type="table" w:styleId="MediumShading1-Accent5">
+  <w:style w:type="table" w:styleId="Tramemoyenne1-Accent5">
     <w:name w:val="Medium Shading 1 Accent 5"/>
-    <w:basedOn w:val="TableNormal"/>
+    <w:basedOn w:val="TableauNormal"/>
     <w:uiPriority w:val="63"/>
     <w:rsid w:val="00CB0664"/>
     <w:pPr>
@@ -9975,9 +9460,9 @@
       </w:tcPr>
     </w:tblStylePr>
   </w:style>
-  <w:style w:type="table" w:styleId="MediumShading1-Accent6">
+  <w:style w:type="table" w:styleId="Tramemoyenne1-Accent6">
     <w:name w:val="Medium Shading 1 Accent 6"/>
-    <w:basedOn w:val="TableNormal"/>
+    <w:basedOn w:val="TableauNormal"/>
     <w:uiPriority w:val="63"/>
     <w:rsid w:val="00CB0664"/>
     <w:pPr>
@@ -10074,9 +9559,9 @@
       </w:tcPr>
     </w:tblStylePr>
   </w:style>
-  <w:style w:type="table" w:styleId="MediumShading2">
+  <w:style w:type="table" w:styleId="Tramemoyenne2">
     <w:name w:val="Medium Shading 2"/>
-    <w:basedOn w:val="TableNormal"/>
+    <w:basedOn w:val="TableauNormal"/>
     <w:uiPriority w:val="64"/>
     <w:rsid w:val="00CB0664"/>
     <w:pPr>
@@ -10216,9 +9701,9 @@
       </w:tcPr>
     </w:tblStylePr>
   </w:style>
-  <w:style w:type="table" w:styleId="MediumShading2-Accent1">
+  <w:style w:type="table" w:styleId="Tramemoyenne2-Accent1">
     <w:name w:val="Medium Shading 2 Accent 1"/>
-    <w:basedOn w:val="TableNormal"/>
+    <w:basedOn w:val="TableauNormal"/>
     <w:uiPriority w:val="64"/>
     <w:rsid w:val="00CB0664"/>
     <w:pPr>
@@ -10358,9 +9843,9 @@
       </w:tcPr>
     </w:tblStylePr>
   </w:style>
-  <w:style w:type="table" w:styleId="MediumShading2-Accent2">
+  <w:style w:type="table" w:styleId="Tramemoyenne2-Accent2">
     <w:name w:val="Medium Shading 2 Accent 2"/>
-    <w:basedOn w:val="TableNormal"/>
+    <w:basedOn w:val="TableauNormal"/>
     <w:uiPriority w:val="64"/>
     <w:rsid w:val="00CB0664"/>
     <w:pPr>
@@ -10500,9 +9985,9 @@
       </w:tcPr>
     </w:tblStylePr>
   </w:style>
-  <w:style w:type="table" w:styleId="MediumShading2-Accent3">
+  <w:style w:type="table" w:styleId="Tramemoyenne2-Accent3">
     <w:name w:val="Medium Shading 2 Accent 3"/>
-    <w:basedOn w:val="TableNormal"/>
+    <w:basedOn w:val="TableauNormal"/>
     <w:uiPriority w:val="64"/>
     <w:rsid w:val="00CB0664"/>
     <w:pPr>
@@ -10642,9 +10127,9 @@
       </w:tcPr>
     </w:tblStylePr>
   </w:style>
-  <w:style w:type="table" w:styleId="MediumShading2-Accent4">
+  <w:style w:type="table" w:styleId="Tramemoyenne2-Accent4">
     <w:name w:val="Medium Shading 2 Accent 4"/>
-    <w:basedOn w:val="TableNormal"/>
+    <w:basedOn w:val="TableauNormal"/>
     <w:uiPriority w:val="64"/>
     <w:rsid w:val="00CB0664"/>
     <w:pPr>
@@ -10784,9 +10269,9 @@
       </w:tcPr>
     </w:tblStylePr>
   </w:style>
-  <w:style w:type="table" w:styleId="MediumShading2-Accent5">
+  <w:style w:type="table" w:styleId="Tramemoyenne2-Accent5">
     <w:name w:val="Medium Shading 2 Accent 5"/>
-    <w:basedOn w:val="TableNormal"/>
+    <w:basedOn w:val="TableauNormal"/>
     <w:uiPriority w:val="64"/>
     <w:rsid w:val="00CB0664"/>
     <w:pPr>
@@ -10926,9 +10411,9 @@
       </w:tcPr>
     </w:tblStylePr>
   </w:style>
-  <w:style w:type="table" w:styleId="MediumShading2-Accent6">
+  <w:style w:type="table" w:styleId="Tramemoyenne2-Accent6">
     <w:name w:val="Medium Shading 2 Accent 6"/>
-    <w:basedOn w:val="TableNormal"/>
+    <w:basedOn w:val="TableauNormal"/>
     <w:uiPriority w:val="64"/>
     <w:rsid w:val="00CB0664"/>
     <w:pPr>
@@ -11068,9 +10553,9 @@
       </w:tcPr>
     </w:tblStylePr>
   </w:style>
-  <w:style w:type="table" w:styleId="MediumList1">
+  <w:style w:type="table" w:styleId="Listemoyenne1">
     <w:name w:val="Medium List 1"/>
-    <w:basedOn w:val="TableNormal"/>
+    <w:basedOn w:val="TableauNormal"/>
     <w:uiPriority w:val="65"/>
     <w:rsid w:val="00CB0664"/>
     <w:pPr>
@@ -11145,9 +10630,9 @@
       </w:tcPr>
     </w:tblStylePr>
   </w:style>
-  <w:style w:type="table" w:styleId="MediumList1-Accent1">
+  <w:style w:type="table" w:styleId="Listemoyenne1-Accent1">
     <w:name w:val="Medium List 1 Accent 1"/>
-    <w:basedOn w:val="TableNormal"/>
+    <w:basedOn w:val="TableauNormal"/>
     <w:uiPriority w:val="65"/>
     <w:rsid w:val="00CB0664"/>
     <w:pPr>
@@ -11222,9 +10707,9 @@
       </w:tcPr>
     </w:tblStylePr>
   </w:style>
-  <w:style w:type="table" w:styleId="MediumList1-Accent2">
+  <w:style w:type="table" w:styleId="Listemoyenne1-Accent2">
     <w:name w:val="Medium List 1 Accent 2"/>
-    <w:basedOn w:val="TableNormal"/>
+    <w:basedOn w:val="TableauNormal"/>
     <w:uiPriority w:val="65"/>
     <w:rsid w:val="00CB0664"/>
     <w:pPr>
@@ -11299,9 +10784,9 @@
       </w:tcPr>
     </w:tblStylePr>
   </w:style>
-  <w:style w:type="table" w:styleId="MediumList1-Accent3">
+  <w:style w:type="table" w:styleId="Listemoyenne1-Accent3">
     <w:name w:val="Medium List 1 Accent 3"/>
-    <w:basedOn w:val="TableNormal"/>
+    <w:basedOn w:val="TableauNormal"/>
     <w:uiPriority w:val="65"/>
     <w:rsid w:val="00CB0664"/>
     <w:pPr>
@@ -11376,9 +10861,9 @@
       </w:tcPr>
     </w:tblStylePr>
   </w:style>
-  <w:style w:type="table" w:styleId="MediumList1-Accent4">
+  <w:style w:type="table" w:styleId="Listemoyenne1-Accent4">
     <w:name w:val="Medium List 1 Accent 4"/>
-    <w:basedOn w:val="TableNormal"/>
+    <w:basedOn w:val="TableauNormal"/>
     <w:uiPriority w:val="65"/>
     <w:rsid w:val="00CB0664"/>
     <w:pPr>
@@ -11453,9 +10938,9 @@
       </w:tcPr>
     </w:tblStylePr>
   </w:style>
-  <w:style w:type="table" w:styleId="MediumList1-Accent5">
+  <w:style w:type="table" w:styleId="Listemoyenne1-Accent5">
     <w:name w:val="Medium List 1 Accent 5"/>
-    <w:basedOn w:val="TableNormal"/>
+    <w:basedOn w:val="TableauNormal"/>
     <w:uiPriority w:val="65"/>
     <w:rsid w:val="00CB0664"/>
     <w:pPr>
@@ -11530,9 +11015,9 @@
       </w:tcPr>
     </w:tblStylePr>
   </w:style>
-  <w:style w:type="table" w:styleId="MediumList1-Accent6">
+  <w:style w:type="table" w:styleId="Listemoyenne1-Accent6">
     <w:name w:val="Medium List 1 Accent 6"/>
-    <w:basedOn w:val="TableNormal"/>
+    <w:basedOn w:val="TableauNormal"/>
     <w:uiPriority w:val="65"/>
     <w:rsid w:val="00CB0664"/>
     <w:pPr>
@@ -11607,9 +11092,9 @@
       </w:tcPr>
     </w:tblStylePr>
   </w:style>
-  <w:style w:type="table" w:styleId="MediumList2">
+  <w:style w:type="table" w:styleId="Listemoyenne2">
     <w:name w:val="Medium List 2"/>
-    <w:basedOn w:val="TableNormal"/>
+    <w:basedOn w:val="TableauNormal"/>
     <w:uiPriority w:val="66"/>
     <w:rsid w:val="00CB0664"/>
     <w:pPr>
@@ -11728,9 +11213,9 @@
       </w:tcPr>
     </w:tblStylePr>
   </w:style>
-  <w:style w:type="table" w:styleId="MediumList2-Accent1">
+  <w:style w:type="table" w:styleId="Listemoyenne2-Accent1">
     <w:name w:val="Medium List 2 Accent 1"/>
-    <w:basedOn w:val="TableNormal"/>
+    <w:basedOn w:val="TableauNormal"/>
     <w:uiPriority w:val="66"/>
     <w:rsid w:val="00CB0664"/>
     <w:pPr>
@@ -11849,9 +11334,9 @@
       </w:tcPr>
     </w:tblStylePr>
   </w:style>
-  <w:style w:type="table" w:styleId="MediumList2-Accent2">
+  <w:style w:type="table" w:styleId="Listemoyenne2-Accent2">
     <w:name w:val="Medium List 2 Accent 2"/>
-    <w:basedOn w:val="TableNormal"/>
+    <w:basedOn w:val="TableauNormal"/>
     <w:uiPriority w:val="66"/>
     <w:rsid w:val="00CB0664"/>
     <w:pPr>
@@ -11970,9 +11455,9 @@
       </w:tcPr>
     </w:tblStylePr>
   </w:style>
-  <w:style w:type="table" w:styleId="MediumList2-Accent3">
+  <w:style w:type="table" w:styleId="Listemoyenne2-Accent3">
     <w:name w:val="Medium List 2 Accent 3"/>
-    <w:basedOn w:val="TableNormal"/>
+    <w:basedOn w:val="TableauNormal"/>
     <w:uiPriority w:val="66"/>
     <w:rsid w:val="00CB0664"/>
     <w:pPr>
@@ -12091,9 +11576,9 @@
       </w:tcPr>
     </w:tblStylePr>
   </w:style>
-  <w:style w:type="table" w:styleId="MediumList2-Accent4">
+  <w:style w:type="table" w:styleId="Listemoyenne2-Accent4">
     <w:name w:val="Medium List 2 Accent 4"/>
-    <w:basedOn w:val="TableNormal"/>
+    <w:basedOn w:val="TableauNormal"/>
     <w:uiPriority w:val="66"/>
     <w:rsid w:val="00CB0664"/>
     <w:pPr>
@@ -12212,9 +11697,9 @@
       </w:tcPr>
     </w:tblStylePr>
   </w:style>
-  <w:style w:type="table" w:styleId="MediumList2-Accent5">
+  <w:style w:type="table" w:styleId="Listemoyenne2-Accent5">
     <w:name w:val="Medium List 2 Accent 5"/>
-    <w:basedOn w:val="TableNormal"/>
+    <w:basedOn w:val="TableauNormal"/>
     <w:uiPriority w:val="66"/>
     <w:rsid w:val="00CB0664"/>
     <w:pPr>
@@ -12333,9 +11818,9 @@
       </w:tcPr>
     </w:tblStylePr>
   </w:style>
-  <w:style w:type="table" w:styleId="MediumList2-Accent6">
+  <w:style w:type="table" w:styleId="Listemoyenne2-Accent6">
     <w:name w:val="Medium List 2 Accent 6"/>
-    <w:basedOn w:val="TableNormal"/>
+    <w:basedOn w:val="TableauNormal"/>
     <w:uiPriority w:val="66"/>
     <w:rsid w:val="00CB0664"/>
     <w:pPr>
@@ -12454,9 +11939,9 @@
       </w:tcPr>
     </w:tblStylePr>
   </w:style>
-  <w:style w:type="table" w:styleId="MediumGrid1">
+  <w:style w:type="table" w:styleId="Grillemoyenne1">
     <w:name w:val="Medium Grid 1"/>
-    <w:basedOn w:val="TableNormal"/>
+    <w:basedOn w:val="TableauNormal"/>
     <w:uiPriority w:val="67"/>
     <w:rsid w:val="00CB0664"/>
     <w:pPr>
@@ -12520,9 +12005,9 @@
       </w:tcPr>
     </w:tblStylePr>
   </w:style>
-  <w:style w:type="table" w:styleId="MediumGrid1-Accent1">
+  <w:style w:type="table" w:styleId="Grillemoyenne1-Accent1">
     <w:name w:val="Medium Grid 1 Accent 1"/>
-    <w:basedOn w:val="TableNormal"/>
+    <w:basedOn w:val="TableauNormal"/>
     <w:uiPriority w:val="67"/>
     <w:rsid w:val="00CB0664"/>
     <w:pPr>
@@ -12586,9 +12071,9 @@
       </w:tcPr>
     </w:tblStylePr>
   </w:style>
-  <w:style w:type="table" w:styleId="MediumGrid1-Accent2">
+  <w:style w:type="table" w:styleId="Grillemoyenne1-Accent2">
     <w:name w:val="Medium Grid 1 Accent 2"/>
-    <w:basedOn w:val="TableNormal"/>
+    <w:basedOn w:val="TableauNormal"/>
     <w:uiPriority w:val="67"/>
     <w:rsid w:val="00CB0664"/>
     <w:pPr>
@@ -12652,9 +12137,9 @@
       </w:tcPr>
     </w:tblStylePr>
   </w:style>
-  <w:style w:type="table" w:styleId="MediumGrid1-Accent3">
+  <w:style w:type="table" w:styleId="Grillemoyenne1-Accent3">
     <w:name w:val="Medium Grid 1 Accent 3"/>
-    <w:basedOn w:val="TableNormal"/>
+    <w:basedOn w:val="TableauNormal"/>
     <w:uiPriority w:val="67"/>
     <w:rsid w:val="00CB0664"/>
     <w:pPr>
@@ -12718,9 +12203,9 @@
       </w:tcPr>
     </w:tblStylePr>
   </w:style>
-  <w:style w:type="table" w:styleId="MediumGrid1-Accent4">
+  <w:style w:type="table" w:styleId="Grillemoyenne1-Accent4">
     <w:name w:val="Medium Grid 1 Accent 4"/>
-    <w:basedOn w:val="TableNormal"/>
+    <w:basedOn w:val="TableauNormal"/>
     <w:uiPriority w:val="67"/>
     <w:rsid w:val="00CB0664"/>
     <w:pPr>
@@ -12784,9 +12269,9 @@
       </w:tcPr>
     </w:tblStylePr>
   </w:style>
-  <w:style w:type="table" w:styleId="MediumGrid1-Accent5">
+  <w:style w:type="table" w:styleId="Grillemoyenne1-Accent5">
     <w:name w:val="Medium Grid 1 Accent 5"/>
-    <w:basedOn w:val="TableNormal"/>
+    <w:basedOn w:val="TableauNormal"/>
     <w:uiPriority w:val="67"/>
     <w:rsid w:val="00CB0664"/>
     <w:pPr>
@@ -12850,9 +12335,9 @@
       </w:tcPr>
     </w:tblStylePr>
   </w:style>
-  <w:style w:type="table" w:styleId="MediumGrid1-Accent6">
+  <w:style w:type="table" w:styleId="Grillemoyenne1-Accent6">
     <w:name w:val="Medium Grid 1 Accent 6"/>
-    <w:basedOn w:val="TableNormal"/>
+    <w:basedOn w:val="TableauNormal"/>
     <w:uiPriority w:val="67"/>
     <w:rsid w:val="00CB0664"/>
     <w:pPr>
@@ -12916,9 +12401,9 @@
       </w:tcPr>
     </w:tblStylePr>
   </w:style>
-  <w:style w:type="table" w:styleId="MediumGrid2">
+  <w:style w:type="table" w:styleId="Grillemoyenne2">
     <w:name w:val="Medium Grid 2"/>
-    <w:basedOn w:val="TableNormal"/>
+    <w:basedOn w:val="TableauNormal"/>
     <w:uiPriority w:val="68"/>
     <w:rsid w:val="00CB0664"/>
     <w:pPr>
@@ -13034,9 +12519,9 @@
       </w:tcPr>
     </w:tblStylePr>
   </w:style>
-  <w:style w:type="table" w:styleId="MediumGrid2-Accent1">
+  <w:style w:type="table" w:styleId="Grillemoyenne2-Accent1">
     <w:name w:val="Medium Grid 2 Accent 1"/>
-    <w:basedOn w:val="TableNormal"/>
+    <w:basedOn w:val="TableauNormal"/>
     <w:uiPriority w:val="68"/>
     <w:rsid w:val="00CB0664"/>
     <w:pPr>
@@ -13152,9 +12637,9 @@
       </w:tcPr>
     </w:tblStylePr>
   </w:style>
-  <w:style w:type="table" w:styleId="MediumGrid2-Accent2">
+  <w:style w:type="table" w:styleId="Grillemoyenne2-Accent2">
     <w:name w:val="Medium Grid 2 Accent 2"/>
-    <w:basedOn w:val="TableNormal"/>
+    <w:basedOn w:val="TableauNormal"/>
     <w:uiPriority w:val="68"/>
     <w:rsid w:val="00CB0664"/>
     <w:pPr>
@@ -13270,9 +12755,9 @@
       </w:tcPr>
     </w:tblStylePr>
   </w:style>
-  <w:style w:type="table" w:styleId="MediumGrid2-Accent3">
+  <w:style w:type="table" w:styleId="Grillemoyenne2-Accent3">
     <w:name w:val="Medium Grid 2 Accent 3"/>
-    <w:basedOn w:val="TableNormal"/>
+    <w:basedOn w:val="TableauNormal"/>
     <w:uiPriority w:val="68"/>
     <w:rsid w:val="00CB0664"/>
     <w:pPr>
@@ -13388,9 +12873,9 @@
       </w:tcPr>
     </w:tblStylePr>
   </w:style>
-  <w:style w:type="table" w:styleId="MediumGrid2-Accent4">
+  <w:style w:type="table" w:styleId="Grillemoyenne2-Accent4">
     <w:name w:val="Medium Grid 2 Accent 4"/>
-    <w:basedOn w:val="TableNormal"/>
+    <w:basedOn w:val="TableauNormal"/>
     <w:uiPriority w:val="68"/>
     <w:rsid w:val="00CB0664"/>
     <w:pPr>
@@ -13506,9 +12991,9 @@
       </w:tcPr>
     </w:tblStylePr>
   </w:style>
-  <w:style w:type="table" w:styleId="MediumGrid2-Accent5">
+  <w:style w:type="table" w:styleId="Grillemoyenne2-Accent5">
     <w:name w:val="Medium Grid 2 Accent 5"/>
-    <w:basedOn w:val="TableNormal"/>
+    <w:basedOn w:val="TableauNormal"/>
     <w:uiPriority w:val="68"/>
     <w:rsid w:val="00CB0664"/>
     <w:pPr>
@@ -13624,9 +13109,9 @@
       </w:tcPr>
     </w:tblStylePr>
   </w:style>
-  <w:style w:type="table" w:styleId="MediumGrid2-Accent6">
+  <w:style w:type="table" w:styleId="Grillemoyenne2-Accent6">
     <w:name w:val="Medium Grid 2 Accent 6"/>
-    <w:basedOn w:val="TableNormal"/>
+    <w:basedOn w:val="TableauNormal"/>
     <w:uiPriority w:val="68"/>
     <w:rsid w:val="00CB0664"/>
     <w:pPr>
@@ -13742,9 +13227,9 @@
       </w:tcPr>
     </w:tblStylePr>
   </w:style>
-  <w:style w:type="table" w:styleId="MediumGrid3">
+  <w:style w:type="table" w:styleId="Grillemoyenne3">
     <w:name w:val="Medium Grid 3"/>
-    <w:basedOn w:val="TableNormal"/>
+    <w:basedOn w:val="TableauNormal"/>
     <w:uiPriority w:val="69"/>
     <w:rsid w:val="00CB0664"/>
     <w:pPr>
@@ -13876,9 +13361,9 @@
       </w:tcPr>
     </w:tblStylePr>
   </w:style>
-  <w:style w:type="table" w:styleId="MediumGrid3-Accent1">
+  <w:style w:type="table" w:styleId="Grillemoyenne3-Accent1">
     <w:name w:val="Medium Grid 3 Accent 1"/>
-    <w:basedOn w:val="TableNormal"/>
+    <w:basedOn w:val="TableauNormal"/>
     <w:uiPriority w:val="69"/>
     <w:rsid w:val="00CB0664"/>
     <w:pPr>
@@ -14010,9 +13495,9 @@
       </w:tcPr>
     </w:tblStylePr>
   </w:style>
-  <w:style w:type="table" w:styleId="MediumGrid3-Accent2">
+  <w:style w:type="table" w:styleId="Grillemoyenne3-Accent2">
     <w:name w:val="Medium Grid 3 Accent 2"/>
-    <w:basedOn w:val="TableNormal"/>
+    <w:basedOn w:val="TableauNormal"/>
     <w:uiPriority w:val="69"/>
     <w:rsid w:val="00CB0664"/>
     <w:pPr>
@@ -14144,9 +13629,9 @@
       </w:tcPr>
     </w:tblStylePr>
   </w:style>
-  <w:style w:type="table" w:styleId="MediumGrid3-Accent3">
+  <w:style w:type="table" w:styleId="Grillemoyenne3-Accent3">
     <w:name w:val="Medium Grid 3 Accent 3"/>
-    <w:basedOn w:val="TableNormal"/>
+    <w:basedOn w:val="TableauNormal"/>
     <w:uiPriority w:val="69"/>
     <w:rsid w:val="00CB0664"/>
     <w:pPr>
@@ -14278,9 +13763,9 @@
       </w:tcPr>
     </w:tblStylePr>
   </w:style>
-  <w:style w:type="table" w:styleId="MediumGrid3-Accent4">
+  <w:style w:type="table" w:styleId="Grillemoyenne3-Accent4">
     <w:name w:val="Medium Grid 3 Accent 4"/>
-    <w:basedOn w:val="TableNormal"/>
+    <w:basedOn w:val="TableauNormal"/>
     <w:uiPriority w:val="69"/>
     <w:rsid w:val="00CB0664"/>
     <w:pPr>
@@ -14412,9 +13897,9 @@
       </w:tcPr>
     </w:tblStylePr>
   </w:style>
-  <w:style w:type="table" w:styleId="MediumGrid3-Accent5">
+  <w:style w:type="table" w:styleId="Grillemoyenne3-Accent5">
     <w:name w:val="Medium Grid 3 Accent 5"/>
-    <w:basedOn w:val="TableNormal"/>
+    <w:basedOn w:val="TableauNormal"/>
     <w:uiPriority w:val="69"/>
     <w:rsid w:val="00CB0664"/>
     <w:pPr>
@@ -14546,9 +14031,9 @@
       </w:tcPr>
     </w:tblStylePr>
   </w:style>
-  <w:style w:type="table" w:styleId="MediumGrid3-Accent6">
+  <w:style w:type="table" w:styleId="Grillemoyenne3-Accent6">
     <w:name w:val="Medium Grid 3 Accent 6"/>
-    <w:basedOn w:val="TableNormal"/>
+    <w:basedOn w:val="TableauNormal"/>
     <w:uiPriority w:val="69"/>
     <w:rsid w:val="00CB0664"/>
     <w:pPr>
@@ -14680,9 +14165,9 @@
       </w:tcPr>
     </w:tblStylePr>
   </w:style>
-  <w:style w:type="table" w:styleId="DarkList">
+  <w:style w:type="table" w:styleId="Listefonce">
     <w:name w:val="Dark List"/>
-    <w:basedOn w:val="TableNormal"/>
+    <w:basedOn w:val="TableauNormal"/>
     <w:uiPriority w:val="70"/>
     <w:rsid w:val="00CB0664"/>
     <w:pPr>
@@ -14787,9 +14272,9 @@
       </w:tcPr>
     </w:tblStylePr>
   </w:style>
-  <w:style w:type="table" w:styleId="DarkList-Accent1">
+  <w:style w:type="table" w:styleId="Listefonce-Accent1">
     <w:name w:val="Dark List Accent 1"/>
-    <w:basedOn w:val="TableNormal"/>
+    <w:basedOn w:val="TableauNormal"/>
     <w:uiPriority w:val="70"/>
     <w:rsid w:val="00CB0664"/>
     <w:pPr>
@@ -14894,9 +14379,9 @@
       </w:tcPr>
     </w:tblStylePr>
   </w:style>
-  <w:style w:type="table" w:styleId="DarkList-Accent2">
+  <w:style w:type="table" w:styleId="Listefonce-Accent2">
     <w:name w:val="Dark List Accent 2"/>
-    <w:basedOn w:val="TableNormal"/>
+    <w:basedOn w:val="TableauNormal"/>
     <w:uiPriority w:val="70"/>
     <w:rsid w:val="00CB0664"/>
     <w:pPr>
@@ -15001,9 +14486,9 @@
       </w:tcPr>
     </w:tblStylePr>
   </w:style>
-  <w:style w:type="table" w:styleId="DarkList-Accent3">
+  <w:style w:type="table" w:styleId="Listefonce-Accent3">
     <w:name w:val="Dark List Accent 3"/>
-    <w:basedOn w:val="TableNormal"/>
+    <w:basedOn w:val="TableauNormal"/>
     <w:uiPriority w:val="70"/>
     <w:rsid w:val="00CB0664"/>
     <w:pPr>
@@ -15108,9 +14593,9 @@
       </w:tcPr>
     </w:tblStylePr>
   </w:style>
-  <w:style w:type="table" w:styleId="DarkList-Accent4">
+  <w:style w:type="table" w:styleId="Listefonce-Accent4">
     <w:name w:val="Dark List Accent 4"/>
-    <w:basedOn w:val="TableNormal"/>
+    <w:basedOn w:val="TableauNormal"/>
     <w:uiPriority w:val="70"/>
     <w:rsid w:val="00CB0664"/>
     <w:pPr>
@@ -15215,9 +14700,9 @@
       </w:tcPr>
     </w:tblStylePr>
   </w:style>
-  <w:style w:type="table" w:styleId="DarkList-Accent5">
+  <w:style w:type="table" w:styleId="Listefonce-Accent5">
     <w:name w:val="Dark List Accent 5"/>
-    <w:basedOn w:val="TableNormal"/>
+    <w:basedOn w:val="TableauNormal"/>
     <w:uiPriority w:val="70"/>
     <w:rsid w:val="00CB0664"/>
     <w:pPr>
@@ -15322,9 +14807,9 @@
       </w:tcPr>
     </w:tblStylePr>
   </w:style>
-  <w:style w:type="table" w:styleId="DarkList-Accent6">
+  <w:style w:type="table" w:styleId="Listefonce-Accent6">
     <w:name w:val="Dark List Accent 6"/>
-    <w:basedOn w:val="TableNormal"/>
+    <w:basedOn w:val="TableauNormal"/>
     <w:uiPriority w:val="70"/>
     <w:rsid w:val="00CB0664"/>
     <w:pPr>
@@ -15429,9 +14914,9 @@
       </w:tcPr>
     </w:tblStylePr>
   </w:style>
-  <w:style w:type="table" w:styleId="ColorfulShading">
+  <w:style w:type="table" w:styleId="Tramecouleur">
     <w:name w:val="Colorful Shading"/>
-    <w:basedOn w:val="TableNormal"/>
+    <w:basedOn w:val="TableauNormal"/>
     <w:uiPriority w:val="71"/>
     <w:rsid w:val="00CB0664"/>
     <w:pPr>
@@ -15544,9 +15029,9 @@
       </w:rPr>
     </w:tblStylePr>
   </w:style>
-  <w:style w:type="table" w:styleId="ColorfulShading-Accent1">
+  <w:style w:type="table" w:styleId="Tramecouleur-Accent1">
     <w:name w:val="Colorful Shading Accent 1"/>
-    <w:basedOn w:val="TableNormal"/>
+    <w:basedOn w:val="TableauNormal"/>
     <w:uiPriority w:val="71"/>
     <w:rsid w:val="00CB0664"/>
     <w:pPr>
@@ -15659,9 +15144,9 @@
       </w:rPr>
     </w:tblStylePr>
   </w:style>
-  <w:style w:type="table" w:styleId="ColorfulShading-Accent2">
+  <w:style w:type="table" w:styleId="Tramecouleur-Accent2">
     <w:name w:val="Colorful Shading Accent 2"/>
-    <w:basedOn w:val="TableNormal"/>
+    <w:basedOn w:val="TableauNormal"/>
     <w:uiPriority w:val="71"/>
     <w:rsid w:val="00CB0664"/>
     <w:pPr>
@@ -15774,9 +15259,9 @@
       </w:rPr>
     </w:tblStylePr>
   </w:style>
-  <w:style w:type="table" w:styleId="ColorfulShading-Accent3">
+  <w:style w:type="table" w:styleId="Tramecouleur-Accent3">
     <w:name w:val="Colorful Shading Accent 3"/>
-    <w:basedOn w:val="TableNormal"/>
+    <w:basedOn w:val="TableauNormal"/>
     <w:uiPriority w:val="71"/>
     <w:rsid w:val="00CB0664"/>
     <w:pPr>
@@ -15879,9 +15364,9 @@
       </w:tcPr>
     </w:tblStylePr>
   </w:style>
-  <w:style w:type="table" w:styleId="ColorfulShading-Accent4">
+  <w:style w:type="table" w:styleId="Tramecouleur-Accent4">
     <w:name w:val="Colorful Shading Accent 4"/>
-    <w:basedOn w:val="TableNormal"/>
+    <w:basedOn w:val="TableauNormal"/>
     <w:uiPriority w:val="71"/>
     <w:rsid w:val="00CB0664"/>
     <w:pPr>
@@ -15994,9 +15479,9 @@
       </w:rPr>
     </w:tblStylePr>
   </w:style>
-  <w:style w:type="table" w:styleId="ColorfulShading-Accent5">
+  <w:style w:type="table" w:styleId="Tramecouleur-Accent5">
     <w:name w:val="Colorful Shading Accent 5"/>
-    <w:basedOn w:val="TableNormal"/>
+    <w:basedOn w:val="TableauNormal"/>
     <w:uiPriority w:val="71"/>
     <w:rsid w:val="00CB0664"/>
     <w:pPr>
@@ -16109,9 +15594,9 @@
       </w:rPr>
     </w:tblStylePr>
   </w:style>
-  <w:style w:type="table" w:styleId="ColorfulShading-Accent6">
+  <w:style w:type="table" w:styleId="Tramecouleur-Accent6">
     <w:name w:val="Colorful Shading Accent 6"/>
-    <w:basedOn w:val="TableNormal"/>
+    <w:basedOn w:val="TableauNormal"/>
     <w:uiPriority w:val="71"/>
     <w:rsid w:val="00CB0664"/>
     <w:pPr>
@@ -16224,9 +15709,9 @@
       </w:rPr>
     </w:tblStylePr>
   </w:style>
-  <w:style w:type="table" w:styleId="ColorfulList">
+  <w:style w:type="table" w:styleId="Listecouleur">
     <w:name w:val="Colorful List"/>
-    <w:basedOn w:val="TableNormal"/>
+    <w:basedOn w:val="TableauNormal"/>
     <w:uiPriority w:val="72"/>
     <w:rsid w:val="00CB0664"/>
     <w:pPr>
@@ -16303,9 +15788,9 @@
       </w:tcPr>
     </w:tblStylePr>
   </w:style>
-  <w:style w:type="table" w:styleId="ColorfulList-Accent1">
+  <w:style w:type="table" w:styleId="Listecouleur-Accent1">
     <w:name w:val="Colorful List Accent 1"/>
-    <w:basedOn w:val="TableNormal"/>
+    <w:basedOn w:val="TableauNormal"/>
     <w:uiPriority w:val="72"/>
     <w:rsid w:val="00CB0664"/>
     <w:pPr>
@@ -16382,9 +15867,9 @@
       </w:tcPr>
     </w:tblStylePr>
   </w:style>
-  <w:style w:type="table" w:styleId="ColorfulList-Accent2">
+  <w:style w:type="table" w:styleId="Listecouleur-Accent2">
     <w:name w:val="Colorful List Accent 2"/>
-    <w:basedOn w:val="TableNormal"/>
+    <w:basedOn w:val="TableauNormal"/>
     <w:uiPriority w:val="72"/>
     <w:rsid w:val="00CB0664"/>
     <w:pPr>
@@ -16461,9 +15946,9 @@
       </w:tcPr>
     </w:tblStylePr>
   </w:style>
-  <w:style w:type="table" w:styleId="ColorfulList-Accent3">
+  <w:style w:type="table" w:styleId="Listecouleur-Accent3">
     <w:name w:val="Colorful List Accent 3"/>
-    <w:basedOn w:val="TableNormal"/>
+    <w:basedOn w:val="TableauNormal"/>
     <w:uiPriority w:val="72"/>
     <w:rsid w:val="00CB0664"/>
     <w:pPr>
@@ -16540,9 +16025,9 @@
       </w:tcPr>
     </w:tblStylePr>
   </w:style>
-  <w:style w:type="table" w:styleId="ColorfulList-Accent4">
+  <w:style w:type="table" w:styleId="Listecouleur-Accent4">
     <w:name w:val="Colorful List Accent 4"/>
-    <w:basedOn w:val="TableNormal"/>
+    <w:basedOn w:val="TableauNormal"/>
     <w:uiPriority w:val="72"/>
     <w:rsid w:val="00CB0664"/>
     <w:pPr>
@@ -16619,9 +16104,9 @@
       </w:tcPr>
     </w:tblStylePr>
   </w:style>
-  <w:style w:type="table" w:styleId="ColorfulList-Accent5">
+  <w:style w:type="table" w:styleId="Listecouleur-Accent5">
     <w:name w:val="Colorful List Accent 5"/>
-    <w:basedOn w:val="TableNormal"/>
+    <w:basedOn w:val="TableauNormal"/>
     <w:uiPriority w:val="72"/>
     <w:rsid w:val="00CB0664"/>
     <w:pPr>
@@ -16698,9 +16183,9 @@
       </w:tcPr>
     </w:tblStylePr>
   </w:style>
-  <w:style w:type="table" w:styleId="ColorfulList-Accent6">
+  <w:style w:type="table" w:styleId="Listecouleur-Accent6">
     <w:name w:val="Colorful List Accent 6"/>
-    <w:basedOn w:val="TableNormal"/>
+    <w:basedOn w:val="TableauNormal"/>
     <w:uiPriority w:val="72"/>
     <w:rsid w:val="00CB0664"/>
     <w:pPr>
@@ -16777,9 +16262,9 @@
       </w:tcPr>
     </w:tblStylePr>
   </w:style>
-  <w:style w:type="table" w:styleId="ColorfulGrid">
+  <w:style w:type="table" w:styleId="Grillecouleur">
     <w:name w:val="Colorful Grid"/>
-    <w:basedOn w:val="TableNormal"/>
+    <w:basedOn w:val="TableauNormal"/>
     <w:uiPriority w:val="73"/>
     <w:rsid w:val="00CB0664"/>
     <w:pPr>
@@ -16850,9 +16335,9 @@
       </w:tcPr>
     </w:tblStylePr>
   </w:style>
-  <w:style w:type="table" w:styleId="ColorfulGrid-Accent1">
+  <w:style w:type="table" w:styleId="Grillecouleur-Accent1">
     <w:name w:val="Colorful Grid Accent 1"/>
-    <w:basedOn w:val="TableNormal"/>
+    <w:basedOn w:val="TableauNormal"/>
     <w:uiPriority w:val="73"/>
     <w:rsid w:val="00CB0664"/>
     <w:pPr>
@@ -16923,9 +16408,9 @@
       </w:tcPr>
     </w:tblStylePr>
   </w:style>
-  <w:style w:type="table" w:styleId="ColorfulGrid-Accent2">
+  <w:style w:type="table" w:styleId="Grillecouleur-Accent2">
     <w:name w:val="Colorful Grid Accent 2"/>
-    <w:basedOn w:val="TableNormal"/>
+    <w:basedOn w:val="TableauNormal"/>
     <w:uiPriority w:val="73"/>
     <w:rsid w:val="00CB0664"/>
     <w:pPr>
@@ -16996,9 +16481,9 @@
       </w:tcPr>
     </w:tblStylePr>
   </w:style>
-  <w:style w:type="table" w:styleId="ColorfulGrid-Accent3">
+  <w:style w:type="table" w:styleId="Grillecouleur-Accent3">
     <w:name w:val="Colorful Grid Accent 3"/>
-    <w:basedOn w:val="TableNormal"/>
+    <w:basedOn w:val="TableauNormal"/>
     <w:uiPriority w:val="73"/>
     <w:rsid w:val="00CB0664"/>
     <w:pPr>
@@ -17069,9 +16554,9 @@
       </w:tcPr>
     </w:tblStylePr>
   </w:style>
-  <w:style w:type="table" w:styleId="ColorfulGrid-Accent4">
+  <w:style w:type="table" w:styleId="Grillecouleur-Accent4">
     <w:name w:val="Colorful Grid Accent 4"/>
-    <w:basedOn w:val="TableNormal"/>
+    <w:basedOn w:val="TableauNormal"/>
     <w:uiPriority w:val="73"/>
     <w:rsid w:val="00CB0664"/>
     <w:pPr>
@@ -17142,9 +16627,9 @@
       </w:tcPr>
     </w:tblStylePr>
   </w:style>
-  <w:style w:type="table" w:styleId="ColorfulGrid-Accent5">
+  <w:style w:type="table" w:styleId="Grillecouleur-Accent5">
     <w:name w:val="Colorful Grid Accent 5"/>
-    <w:basedOn w:val="TableNormal"/>
+    <w:basedOn w:val="TableauNormal"/>
     <w:uiPriority w:val="73"/>
     <w:rsid w:val="00CB0664"/>
     <w:pPr>
@@ -17215,9 +16700,9 @@
       </w:tcPr>
     </w:tblStylePr>
   </w:style>
-  <w:style w:type="table" w:styleId="ColorfulGrid-Accent6">
+  <w:style w:type="table" w:styleId="Grillecouleur-Accent6">
     <w:name w:val="Colorful Grid Accent 6"/>
-    <w:basedOn w:val="TableNormal"/>
+    <w:basedOn w:val="TableauNormal"/>
     <w:uiPriority w:val="73"/>
     <w:rsid w:val="00CB0664"/>
     <w:pPr>
@@ -17288,9 +16773,9 @@
       </w:tcPr>
     </w:tblStylePr>
   </w:style>
-  <w:style w:type="character" w:styleId="CommentReference">
+  <w:style w:type="character" w:styleId="Marquedecommentaire">
     <w:name w:val="annotation reference"/>
-    <w:basedOn w:val="DefaultParagraphFont"/>
+    <w:basedOn w:val="Policepardfaut"/>
     <w:uiPriority w:val="99"/>
     <w:semiHidden/>
     <w:unhideWhenUsed/>
@@ -17300,10 +16785,10 @@
       <w:szCs w:val="16"/>
     </w:rPr>
   </w:style>
-  <w:style w:type="paragraph" w:styleId="CommentText">
+  <w:style w:type="paragraph" w:styleId="Commentaire">
     <w:name w:val="annotation text"/>
     <w:basedOn w:val="Normal"/>
-    <w:link w:val="CommentTextChar"/>
+    <w:link w:val="CommentaireCar"/>
     <w:uiPriority w:val="99"/>
     <w:unhideWhenUsed/>
     <w:rsid w:val="004B0A37"/>
@@ -17314,10 +16799,10 @@
       <w:szCs w:val="20"/>
     </w:rPr>
   </w:style>
-  <w:style w:type="character" w:customStyle="1" w:styleId="CommentTextChar">
-    <w:name w:val="Comment Text Char"/>
-    <w:basedOn w:val="DefaultParagraphFont"/>
-    <w:link w:val="CommentText"/>
+  <w:style w:type="character" w:customStyle="1" w:styleId="CommentaireCar">
+    <w:name w:val="Commentaire Car"/>
+    <w:basedOn w:val="Policepardfaut"/>
+    <w:link w:val="Commentaire"/>
     <w:uiPriority w:val="99"/>
     <w:rsid w:val="004B0A37"/>
     <w:rPr>
@@ -17326,11 +16811,11 @@
       <w:szCs w:val="20"/>
     </w:rPr>
   </w:style>
-  <w:style w:type="paragraph" w:styleId="CommentSubject">
+  <w:style w:type="paragraph" w:styleId="Objetducommentaire">
     <w:name w:val="annotation subject"/>
-    <w:basedOn w:val="CommentText"/>
-    <w:next w:val="CommentText"/>
-    <w:link w:val="CommentSubjectChar"/>
+    <w:basedOn w:val="Commentaire"/>
+    <w:next w:val="Commentaire"/>
+    <w:link w:val="ObjetducommentaireCar"/>
     <w:uiPriority w:val="99"/>
     <w:semiHidden/>
     <w:unhideWhenUsed/>
@@ -17340,10 +16825,10 @@
       <w:bCs/>
     </w:rPr>
   </w:style>
-  <w:style w:type="character" w:customStyle="1" w:styleId="CommentSubjectChar">
-    <w:name w:val="Comment Subject Char"/>
-    <w:basedOn w:val="CommentTextChar"/>
-    <w:link w:val="CommentSubject"/>
+  <w:style w:type="character" w:customStyle="1" w:styleId="ObjetducommentaireCar">
+    <w:name w:val="Objet du commentaire Car"/>
+    <w:basedOn w:val="CommentaireCar"/>
+    <w:link w:val="Objetducommentaire"/>
     <w:uiPriority w:val="99"/>
     <w:semiHidden/>
     <w:rsid w:val="004B0A37"/>
@@ -17355,9 +16840,9 @@
       <w:szCs w:val="20"/>
     </w:rPr>
   </w:style>
-  <w:style w:type="character" w:styleId="Hyperlink">
+  <w:style w:type="character" w:styleId="Lienhypertexte">
     <w:name w:val="Hyperlink"/>
-    <w:basedOn w:val="DefaultParagraphFont"/>
+    <w:basedOn w:val="Policepardfaut"/>
     <w:uiPriority w:val="99"/>
     <w:unhideWhenUsed/>
     <w:rsid w:val="000C14B4"/>
@@ -17366,9 +16851,9 @@
       <w:u w:val="single"/>
     </w:rPr>
   </w:style>
-  <w:style w:type="character" w:styleId="UnresolvedMention">
+  <w:style w:type="character" w:styleId="Mentionnonrsolue">
     <w:name w:val="Unresolved Mention"/>
-    <w:basedOn w:val="DefaultParagraphFont"/>
+    <w:basedOn w:val="Policepardfaut"/>
     <w:uiPriority w:val="99"/>
     <w:semiHidden/>
     <w:unhideWhenUsed/>
@@ -17378,10 +16863,10 @@
       <w:shd w:val="clear" w:color="auto" w:fill="E1DFDD"/>
     </w:rPr>
   </w:style>
-  <w:style w:type="paragraph" w:styleId="FootnoteText">
+  <w:style w:type="paragraph" w:styleId="Notedebasdepage">
     <w:name w:val="footnote text"/>
     <w:basedOn w:val="Normal"/>
-    <w:link w:val="FootnoteTextChar"/>
+    <w:link w:val="NotedebasdepageCar"/>
     <w:uiPriority w:val="99"/>
     <w:semiHidden/>
     <w:unhideWhenUsed/>
@@ -17393,10 +16878,10 @@
       <w:szCs w:val="20"/>
     </w:rPr>
   </w:style>
-  <w:style w:type="character" w:customStyle="1" w:styleId="FootnoteTextChar">
-    <w:name w:val="Footnote Text Char"/>
-    <w:basedOn w:val="DefaultParagraphFont"/>
-    <w:link w:val="FootnoteText"/>
+  <w:style w:type="character" w:customStyle="1" w:styleId="NotedebasdepageCar">
+    <w:name w:val="Note de bas de page Car"/>
+    <w:basedOn w:val="Policepardfaut"/>
+    <w:link w:val="Notedebasdepage"/>
     <w:uiPriority w:val="99"/>
     <w:semiHidden/>
     <w:rsid w:val="00E55ACA"/>
@@ -17406,9 +16891,9 @@
       <w:szCs w:val="20"/>
     </w:rPr>
   </w:style>
-  <w:style w:type="character" w:styleId="FootnoteReference">
+  <w:style w:type="character" w:styleId="Appelnotedebasdep">
     <w:name w:val="footnote reference"/>
-    <w:basedOn w:val="DefaultParagraphFont"/>
+    <w:basedOn w:val="Policepardfaut"/>
     <w:uiPriority w:val="99"/>
     <w:semiHidden/>
     <w:unhideWhenUsed/>
@@ -17417,7 +16902,7 @@
       <w:vertAlign w:val="superscript"/>
     </w:rPr>
   </w:style>
-  <w:style w:type="paragraph" w:styleId="Revision">
+  <w:style w:type="paragraph" w:styleId="Rvision">
     <w:name w:val="Revision"/>
     <w:hidden/>
     <w:uiPriority w:val="99"/>

</xml_diff>